<commit_message>
Proofcheck Flour Play Norwegian: MINOR (30 edits)
Co-Authored-By: Claude Opus 5.5 <noreply@anthropic.com>
Claude-Session: https://claude.ai/code/session_012Cm8JxdqzjuttdUSdkQCUg
</commit_message>
<xml_diff>
--- a/translated/corrected/Flour Play - ASSEMBLED - FORMATTED_Norwegian.docx
+++ b/translated/corrected/Flour Play - ASSEMBLED - FORMATTED_Norwegian.docx
@@ -154,7 +154,7 @@
     <w:p/>
     <w:p>
       <w:r>
-        <w:t>Snøen hadde kommet i løpet av natten. Ikke den tidlige snøen i oktober, som var borte igjen etter en periode med milde dager. Ekte snø. Den typen dypvintersnø som hadde begynt på allehelgensaften og kom til å bli liggende til våren. Den lå langs Evergreen Avenue nå i et solid, rent lag på femten centimeter, og knirket under skoene hver gang noen kom inn og børstet av seg. Over natten hadde butikkene begynt å bytte ut skjelettene og gresskarlyktene med maisstengler og papirkalkuner, selv om de vanlige gresskarene fikk bli igjen på trappene, gode nok til takksigelsesdagen. Gaten hadde blitt stille etter allehelgensaften, i døvperioden før det lange, lyse innrykket mot jul.</w:t>
+        <w:t xml:space="preserve">Snøen hadde kommet i løpet av natten. Ikke den tidlige snøen i oktober, som var borte igjen etter en periode med milde dager. Ekte snø. Den typen dypvintersnø som hadde begynt på allehelgensaften og kom til å bli liggende til våren. Den lå langs Evergreen Avenue nå i et solid, rent lag på femten centimeter, og knirket under skoene hver gang noen kom inn og børstet av seg. Over natten hadde butikkene begynt å bytte ut skjelettene og gresskarlyktene med maisstengler og papirkalkuner, selv om de vanlige gresskarene fikk bli igjen på trappene, gode nok til takksigelsesdagen. Gaten hadde blitt stille etter allehelgensaften, i dødperioden før det lange, lyse innrykket mot jul.</w:t>
       </w:r>
     </w:p>
     <w:p/>
@@ -202,7 +202,7 @@
     <w:p/>
     <w:p>
       <w:r>
-        <w:t xml:space="preserve">Vi var der alle sammen den formiddagen. Hele sirkelen, så nær som når noen var slått ut av forkjølelse eller passet barnebarn. Olivia ved enden av det hele i butikken sin, med garnhespene stablet opp bak seg i alle farger en vinter kan ønske seg. Dot ved siden av henne, ordknapp og rask. Deretter Claire Bennett, som skrev for Gazette, med en notisbok åpen på armlenet fordi Claire aldri hadde ordentlig fri. Hun la stadig fra seg kransen for å skrive ned en linje og plukket den opp et slag etter resten av oss. Ivy ved siden av, som lo så høyt og så beredvillig at butikken virket lysere av å ha henne i seg. Hun hadde på et vis fått bar i håret uten å merke det. Martha, den pensjonerte lærerinnen, enke på ikke fullt et år, med sin lille hvite hund Snowball sovende mot ankelen. Hånden hennes glapp ned med jevne mellomrom for å berøre øret hans. For å forsikre seg om at han fremdeles var der. Og Ellie, snill og rolig, som hadde økt sykehusdugnaden sin til tre dager i uken. Hun møtte en stålramme med den samme stødige ømheten. Kransen hennes ble mindre ut som noe som var laget, og mer som noe som hadde grodd.</w:t>
+        <w:t xml:space="preserve">Vi var der alle sammen den formiddagen. Hele sirkelen, så nær som når noen var slått ut av forkjølelse eller passet barnebarn. Olivia ved enden av det hele i butikken sin, med garnhespene stablet opp bak seg i alle farger en vinter kan ønske seg. Dot ved siden av henne, ordknapp og rask. Deretter Claire Bennett, som skrev for Gazette, med en notisbok åpen på armlenet fordi Claire aldri hadde ordentlig fri. Hun la stadig fra seg kransen for å skrive ned en linje og plukket den opp et slag etter resten av oss. Ivy ved siden av, som lo så høyt og så beredvillig at butikken virket lysere av å ha henne i seg. Hun hadde på et vis fått bar i håret uten å merke det. Martha, den pensjonerte lærerinnen, enke på ikke fullt et år, med sin lille hvite hund Snowball sovende mot ankelen. Hånden hennes glapp ned med jevne mellomrom for å berøre øret hans. For å forsikre seg om at han fremdeles var der. Og Ellie, snill og rolig, som hadde økt sykehusdugnaden sin til tre dager i uken. Hun møtte en stålramme med den samme stødige ømheten. Kransen hennes så mindre ut som noe som var laget, og mer som noe som hadde grodd.</w:t>
       </w:r>
     </w:p>
     <w:p/>
@@ -483,7 +483,7 @@
     <w:p/>
     <w:p>
       <w:r>
-        <w:t xml:space="preserve">– Smak på en. Hun rykket med haken mot et tefat på bordet der hun hadde lagt en enkelt bolle til siden, revet opp. – Vær så god. Jeg vil at noen andre skal fortelle meg at jeg ikke er i ferd med å bli blød i hodet.</w:t>
+        <w:t xml:space="preserve">– Smak på en. Hun rykket med haken mot et tefat på bordet der hun hadde lagt en enkelt bolle til siden, revet opp. – Vær så god. Jeg vil at noen andre skal fortelle meg at jeg ikke er i ferd med å bli bløt i hodet.</w:t>
       </w:r>
     </w:p>
     <w:p/>
@@ -1016,7 +1016,7 @@
     <w:p/>
     <w:p>
       <w:r>
-        <w:t xml:space="preserve">På hjørnet der jeg tok av mot Evergreen, så jeg meg tilbake. Oppover gaten glødde </w:t>
+        <w:t xml:space="preserve">På hjørnet der jeg tok av fra Evergreen, så jeg meg tilbake. Oppover gaten glødde </w:t>
       </w:r>
       <w:r>
         <w:t xml:space="preserve"/>
@@ -1051,7 +1051,7 @@
     <w:p/>
     <w:p>
       <w:r>
-        <w:t xml:space="preserve">Jeg gikk tilbake til Holly Jolly neste morgen og fant Greta i arbeid, enda jeg hadde sagt til henne at hun måtte hvile. Hele butikklokalet var gjort i stand. Gulvet var vasket til det glinser, og montrene var tørket av og tomme. Greta var dypt oppslukt i en ny røre, ettersom hun hadde bestemt seg for å gi ovnen ett forsøk til.</w:t>
+        <w:t xml:space="preserve">Jeg gikk tilbake til Holly Jolly neste morgen og fant Greta i arbeid, enda jeg hadde sagt til henne at hun måtte hvile. Hele butikklokalet var gjort i stand. Gulvet var vasket til det glinset, og montrene var tørket av og tomme. Greta var dypt oppslukt i en ny røre, ettersom hun hadde bestemt seg for å gi ovnen ett forsøk til.</w:t>
       </w:r>
     </w:p>
     <w:p/>
@@ -1189,7 +1189,7 @@
     <w:p/>
     <w:p>
       <w:r>
-        <w:t>– De tror jeg ikke holder en ren butikk. Stemmen hennes lød flat og rar. – I førti år har jeg holdt det reneste kjøkkenet i denne gaten. Du kan spise rett fra gulvene mine, og det vet du. Og så har de skrevet det der Emma vil lese det mens hun går tur med Snowball, der kirkedamene vil lese det, der alle som noensinne har kjøpt en bursdagskake av meg, kommer til å gå forbi. Og det kommer til å sette seg, litt, enten de mener å la det skje eller ikke. Det er det som er det verste. Det setter seg. Hun snudde seg mot meg, og smerten var tilbake under det flate tonefallet. – Hvem hater meg så til de grader? Jeg har aldri gjort et menneske i denne byen noe vondt. Jeg gir folk mat. Hvem vil at folk skal være redd for maten min?</w:t>
+        <w:t xml:space="preserve">– De tror jeg ikke holder en ren butikk. Stemmen hennes lød flat og rar. – I førti år har jeg holdt det reneste kjøkkenet i denne gaten. Du kan spise rett fra gulvene mine, og det vet du. Og så har de skrevet det der Emma vil lese det mens hun går tur med Snowball, der kirkedamene vil lese det, der alle som noensinne har kjøpt en bursdagskake av meg, kommer til å gå forbi. Og det kommer til å sette seg, litt, enten de mener å la det skje eller ikke. Det er det som er det verste. Det setter seg. Hun snudde seg mot meg, og smerten var tilbake under det flate tonefallet. – Hvem hater meg så til de grader? Jeg har aldri gjort et menneske i denne byen noe vondt. Jeg gir folk mat. Hvem vil at folk skal være redde for maten min?</w:t>
       </w:r>
     </w:p>
     <w:p/>
@@ -1596,7 +1596,7 @@
     <w:p/>
     <w:p>
       <w:r>
-        <w:t xml:space="preserve">– Jeg sier det ingen andre vil si, sa Dot, siden jeg er gammel og ikke bryr meg lenger. – Pete Garcia.</w:t>
+        <w:t xml:space="preserve">– Jeg sier det ingen andre vil si, sa Dot, – siden jeg er gammel og ikke bryr meg lenger. – Pete Garcia.</w:t>
       </w:r>
     </w:p>
     <w:p/>
@@ -1620,7 +1620,7 @@
     <w:p/>
     <w:p>
       <w:r>
-        <w:t>– Butikken hans ligger på den andre siden av allmenningen uten mulighet til å få en lastebil inn, sa Claire, så han leier det gamle kjølelageret i gården bak Evergreen-butikkene. Plass til én lastebil der bak, og to stykker som vil ha den.</w:t>
+        <w:t xml:space="preserve">– Butikken hans ligger på den andre siden av allmenningen uten mulighet til å få en lastebil inn, sa Claire, – så han leier det gamle kjølelageret i gården bak Evergreen-butikkene. Plass til én lastebil der bak, og to stykker som vil ha den.</w:t>
       </w:r>
     </w:p>
     <w:p/>
@@ -2012,7 +2012,7 @@
     <w:p/>
     <w:p>
       <w:r>
-        <w:t xml:space="preserve">– Jeg gjorde det ikke. Jeg snudde en tegning. Han sa det flatt og avslo æren, og jeg forstod at avslaget var en del av soningen. En regel han hadde satt for seg selv mot å bli takket, og som han aktet å holde uansett hvor mye det nagde. – Hvem enn som presset den tegningen inn i rammen med grunnleggerens ord skjult inni, de gjorde det. Jeg tilfeldigvis sorterte boksen den dagen den trengte å bli snudd.</w:t>
+        <w:t xml:space="preserve">– Jeg gjorde det ikke. Jeg snudde en tegning. Han sa det flatt og avslo æren, og jeg forstod at avslaget var en del av soningen. En regel han hadde satt for seg selv mot å bli takket, og som han aktet å holde uansett hvor mye det nagde. – Hvem enn som presset den tegningen inn i rammen med grunnleggerens ord skjult inni, de gjorde det. Jeg sorterte tilfeldigvis boksen den dagen den trengte å bli snudd.</w:t>
       </w:r>
     </w:p>
     <w:p/>
@@ -2832,7 +2832,7 @@
         <w:t>ingen røyk uten ild</w:t>
       </w:r>
       <w:r>
-        <w:t xml:space="preserve"> og føle at det var rimelig å si det. Tom kunne skrubbe bort et ord fra en vegg. Ingen kunne skrubbe bort et stempel. Det snek seg inn, og det ble værende, på det eneste stedet der et bakeri bevarte hele livet sitt. Tilliten fra menneskene som spiser brødet deres.</w:t>
+        <w:t xml:space="preserve"> og føle at det var rimelig å si det. Tom kunne skrubbe bort et ord fra en vegg. Ingen kunne skrubbe bort et stempel. Det snek seg inn, og det ble værende, på det eneste stedet der et bakeri bevarte hele livet sitt. Tilliten fra menneskene som spiser brødet.</w:t>
       </w:r>
     </w:p>
     <w:p/>
@@ -3038,7 +3038,7 @@
     <w:p/>
     <w:p>
       <w:r>
-        <w:t xml:space="preserve">– De er gode folk, sa jeg til ham. – Doucettes. Bedre husverter enn halve gata som visker om dem.</w:t>
+        <w:t xml:space="preserve">– De er gode folk, sa jeg til ham. – Doucettes. Flinkere til å holde hus enn halve gata som hvisker om dem.</w:t>
       </w:r>
     </w:p>
     <w:p/>
@@ -3298,7 +3298,7 @@
     </w:p>
     <w:p>
       <w:r>
-        <w:t xml:space="preserve">– Det er ikke fordervelse, og det var det aldri, sa jeg til henne. – Noen kjøpte det og noen doserte det, og de kjente bransjen til å gjøre det, og de fikk tak i det på en eller annen måte. Jeg så på den rene, umerkede snøen og den ene kalde snømannen som lente seg bort fra alle sine feller.</w:t>
+        <w:t xml:space="preserve">– Det er ikke fordervelse, og det var det aldri, sa jeg til henne. – Noen kjøpte det og noen doserte det, og de kjente bransjen til å gjøre det, og de kom til melet på en eller annen måte. Jeg så på den rene, umerkede snøen og den ene kalde snømannen som lente seg bort fra alle sine feller.</w:t>
       </w:r>
     </w:p>
     <w:p>
@@ -3538,7 +3538,7 @@
     <w:p/>
     <w:p>
       <w:r>
-        <w:t>Jeg lå våken halve natten under det, kartet med Petes navn i den kalde enden av det, og våknet før dagslyset med hele greia midt på brystet og Pip som en varm vekt i korsryggen. Nick sov videre. Jeg lå og så på grålyset som krøp opp i vinduet, og tillot meg å spørre om det jeg hadde nektet å spørre om i smuget. Ikke hvem som kunne ha stått i den karmen, men om mannen kartet førte meg til, var den rette til å ha stått der. Bygdas sladderhanker, som så å si hadde stilt ham for retten, hadde aldri kastet bort en tanke på det andre.</w:t>
+        <w:t xml:space="preserve">Jeg lå våken halve natten under det, kartet med Petes navn i den kalde enden av det, og våknet før dagslyset med hele greia midt på brystet og Pip som en varm vekt i korsryggen. Nick sov videre. Jeg lå og så på grålyset som krøp opp i vinduet, og tillot meg å spørre om det jeg hadde nektet å spørre om i smuget. Ikke hvem som kunne ha stått ved den dørstokken, men om mannen kartet førte meg til, var den rette til å ha stått der. Byens sladderhanker, som så å si hadde stilt ham for retten, hadde aldri kastet bort en tanke på det andre.</w:t>
       </w:r>
     </w:p>
     <w:p/>
@@ -3723,7 +3723,7 @@
     </w:p>
     <w:p>
       <w:r>
-        <w:t>– Danny. Hun tørket hendene i forkleet. – De sier det var Danny. Jeg hørte det i går og har ikke sovet siden. Hun kom rundt disken. – Jessica, jeg sa opp den gutten av den enkleste grunn i verden, og ingenting av det var hans feil. Det var lite å gjøre i høst, og jeg hadde ikke råd til å ha en helgegutt på lønn gjennom det. Jeg satte meg ned med ham og sa det rett ut, og ga ham to ukers lønn han ikke hadde jobbet for og en boks med gårsdagens bakst til moren hans, og han tok imot det stille, skamfull over tårene i øynene, ute av døren før jeg rakk å si halvparten av det jeg ville. Stemmen hennes ble tykkere. – En god arbeider. Trengte litt tid til å tine opp, men stødig når han først gjorde det. Og nå har de malt SKITTENT på veggen min, og jeg klarer ikke å få det til å stemme med gutten som pleide å stille opp morgenboksene mine på snor fordi han ikke holdt ut at de sto skeivt.</w:t>
+        <w:t xml:space="preserve">– Danny. Hun tørket hendene i forkleet. – De sier det var Danny. Jeg hørte det i går og har ikke sovet siden. Hun kom rundt disken. – Jessica, jeg sa opp den gutten av den enkleste grunn i verden, og ingenting av det var hans feil. Det var lite å gjøre i høst, og jeg hadde ikke råd til å ha en helgegutt på lønn gjennom det. Jeg satte meg ned med ham og sa det rett ut, og ga ham to ukers lønn han ikke hadde jobbet for og en boks med gårsdagens bakst til moren hans, og han tok imot det stille, skamfull over tårene i øynene, ute av døren før jeg rakk å si halvparten av det jeg ville. Stemmen hennes ble tykkere. – En god arbeider. Trengte litt tid til å tine opp, men stødig når han først gjorde det. Og nå påstår de at han malte SKITTENT på veggen min, og jeg klarer ikke å få det til å stemme med gutten som pleide å stille opp morgenboksene mine på snor fordi han ikke holdt ut at de sto skeivt.</w:t>
       </w:r>
     </w:p>
     <w:p>
@@ -4009,7 +4009,7 @@
     </w:p>
     <w:p>
       <w:r>
-        <w:t xml:space="preserve">Grendehuset var åpnet for de to innsamlingene samtidig, Hals og Historielagets, og folk i Frost Falls hadde kommet inn fra kulden for å fylle begge to. Hal sto ved mattønnene i den ene enden i sin fine jakke, blitt sjenert av størrelsen på oppmøtet. Han tok imot hermetikk og rotvekster, og fra en kvinne som knapt hadde råd til det, en hel skinke. Han skrev ikke opp noe av det med navn. Bare et antall. Folk som hadde blitt tause og forsiktige siden Gretas problemer begynte, hadde åpnet seg nå. De sto i en varm, støyende sal og ga bort vinterforrådet sitt til naboer de aldri ville få vite navnet på. Pip gikk langs tønneraden én gang, fant sardinene i den andre og ble stående over dem i protest.</w:t>
+        <w:t xml:space="preserve">Grendehuset var åpnet for de to innsamlingene samtidig, Hals og Historielagets, og folk i Frost Falls hadde kommet inn fra kulden for å fylle begge to. Hal sto ved mattønnene i den ene enden i sin fine frakk, blitt sjenert av størrelsen på oppmøtet. Han tok imot hermetikk og rotvekster, og fra en kvinne som knapt hadde råd til det, en hel skinke. Han skrev ikke opp noe av det med navn. Bare et antall. Folk som hadde blitt tause og forsiktige siden Gretas problemer begynte, hadde åpnet seg nå. De sto i en varm, støyende sal og ga bort vinterforrådet sitt til naboer de aldri ville få vite navnet på. Pip gikk langs tønneraden én gang, fant sardinene i den andre og ble stående over dem i protest.</w:t>
       </w:r>
     </w:p>
     <w:p>
@@ -4169,7 +4169,7 @@
     </w:p>
     <w:p>
       <w:r>
-        <w:t xml:space="preserve">Ikke en uke før, for å bygge opp kundekretsen før rushet. Ikke en uke etter, når handelen hadde roet seg. Nøyaktig den uken. Den eneste mørke uken i Gretas år, da byens hele julesøtsakhandel ikke ville ha noen steder å gjøre av seg, og der borte i den fjerne enden av alléen sto en blank, ny patisserie med sine gullbelyste dører slått vidåpne for å fange opp hver eneste sjel av den. Trykt og hengt opp og betalt for en full uke før mannen fra fylket i det hele tatt satte foten sin i Gretas kjøkken.</w:t>
+        <w:t xml:space="preserve">Ikke en uke før, for å bygge opp kundekretsen før rushet. Ikke en uke etter, når handelen hadde roet seg. Nøyaktig den uken. Den eneste mørke uken i Gretas år, da byens hele julesøtsakhandel ikke ville ha noen steder å gjøre av seg, og der borte i den fjerne enden av alléen sto et blankt, nytt konditori med sine gullbelyste dører slått vidåpne for å fange opp hver eneste sjel av den. Trykt og hengt opp og betalt for en full uke før mannen fra fylket i det hele tatt satte foten sin i Gretas kjøkken.</w:t>
       </w:r>
     </w:p>
     <w:p>
@@ -4741,7 +4741,7 @@
     <w:p/>
     <w:p>
       <w:r>
-        <w:t>Kjøkkenet var slik jeg hadde sett det den første dagen, alt i stål, hver eneste overflate blankskurt. Jeg satte meg ikke ned, og hun ba meg ikke om det noen steder heller.</w:t>
+        <w:t xml:space="preserve">Kjøkkenet var slik jeg hadde sett det den første dagen, alt i stål, hver eneste overflate blankskurt. Jeg satte meg ikke ned, og hun ba meg ikke om det heller.</w:t>
       </w:r>
     </w:p>
     <w:p/>
@@ -5225,7 +5225,7 @@
     </w:p>
     <w:p>
       <w:r>
-        <w:t xml:space="preserve">– Jeg la ingenting i det. En sjåfør som stoppet for å ta en dupp. Men Pete kjenner hver eneste lastebil som kommer inn på den gårdsplassen, og han sa det ikke var kjøttbilen, og jeg hørte ingenting fra noen. Jeg flyttet fingeren oppover skjeen til pepperen. – Og Dannys skikkelse. Tynn og rask, ved Gretas dørstokk før ovnene hennes ble tent, og borte opp mot den fjerne enden. Jeg hørte gullbutikken. Han sa aldri at den gikk inn i Sugarplum. Han sa den fjerne enden. Jeg plasserte butikken der selv.</w:t>
+        <w:t xml:space="preserve">– Jeg la ingenting i det. En sjåfør som stoppet for å ta en dupp. Men Pete kjenner hver eneste lastebil som kommer inn på den gårdsplassen, og han sa det ikke var kjøttbilen, og jeg oppfattet det som at den ikke var noens. Jeg flyttet fingeren oppover skjeen til pepperen. – Og Dannys skikkelse. Tynn og rask, ved Gretas dørstokk før ovnene hennes ble tent, og borte opp mot den fjerne enden. Jeg hørte gullbutikken. Han sa aldri at den gikk inn i Sugarplum. Han sa den fjerne enden. Jeg plasserte butikken der selv.</w:t>
       </w:r>
     </w:p>
     <w:p>
@@ -5382,7 +5382,7 @@
     <w:p/>
     <w:p>
       <w:r>
-        <w:t xml:space="preserve">– Jeg fikk den samme samtalen, sa Ivy til meg. – Rett etter Marthas. Samme dame, er jeg nokså sikker på. Hun hadde navnet mitt, nummeret mitt og de tre gresskarpaiene mine. Hun visste til og med at jeg hadde bedt Greta om å få rundstykkene usteikte, så jeg kunne bake dem ut ferske på dagen. Hun blåste over kanten på kruset. – Jeg tenkte at Greta måtte ha gitt Joyce listen sin. Så ingen går glipp av noe. Joyce tok med seg en gryterett til henne på mandag, jeg så varebilen utenfor. Kanskje de to endelig har begravet stridsøksen.</w:t>
+        <w:t xml:space="preserve">– Jeg fikk den samme samtalen, sa Ivy til meg. – Rett etter Marthas. Samme dame, er jeg nokså sikker på. Hun hadde navnet mitt, nummeret mitt og de tre gresskarpaiene mine. Hun visste til og med at jeg hadde bedt Greta om å få rundstykkene ustekte, så jeg kunne bake dem ut ferske på dagen. Hun blåste over kanten på kruset. – Jeg tenkte at Greta måtte ha gitt Joyce listen sin. Så ingen går glipp av noe. Joyce tok med seg en gryterett til henne på mandag, jeg så varebilen utenfor. Kanskje de to endelig har begravet stridsøksen.</w:t>
       </w:r>
     </w:p>
     <w:p/>
@@ -5412,7 +5412,7 @@
     <w:p/>
     <w:p>
       <w:r>
-        <w:t xml:space="preserve">Jeg satte meg i stolen som Olivia skjøv bort til meg, og tok kruset hun stakk i hånden min, og varmen fra den gjorde ingenting med kulden som krøp oppover armene mine.</w:t>
+        <w:t xml:space="preserve">Jeg satte meg i stolen som Olivia skjøv bort til meg, og tok kruset hun stakk i hånden min, og varmen fra det gjorde ingenting med kulden som krøp oppover armene mine.</w:t>
       </w:r>
     </w:p>
     <w:p/>
@@ -5982,7 +5982,7 @@
     <w:p/>
     <w:p>
       <w:r>
-        <w:t>Hun ringte tilbake etter kveldsmaten, da suppebollene sto i vasken og Nick hadde satt seg i stolen sin ved ovnen, med Pip sovende ved føttene sine på varebilen.</w:t>
+        <w:t xml:space="preserve">Hun ringte tilbake etter kveldsmaten, da suppebollene sto i vasken og Nick hadde satt seg i stolen sin ved ovnen, med Pip sovende ved føttene hans på varebilen.</w:t>
       </w:r>
     </w:p>
     <w:p>
@@ -6024,7 +6024,7 @@
     </w:p>
     <w:p>
       <w:r>
-        <w:t xml:space="preserve">– Natriumdiacetat er eddik som er tørket inn på et salt, sa han. – Det er den eddiken som kom opp i røyken da jeg brente en klype sist søndag. Og et salt brenner ikke bort. Det var mer igjen i skålen enn det rent mel etterlater seg, og det skrev jeg ned med en gang. Han tok krukken ned fra hyllen over benken, hvor den hadde stått siden torsdag. Han ristet litt ut på et rent tefat med noen dråper vann og la en ny stripe pH-papir i den. Det ble rødt like fort som før.</w:t>
+        <w:t xml:space="preserve">– Natriumdiacetat er eddik som er tørket inn på et salt, sa han. – Det er den eddiken som kom opp i røyken da jeg brente en klype sist søndag. Og et salt brenner ikke bort. Det var mer igjen i skålen enn det rent mel etterlater seg, og det skrev jeg ned med en gang. Han tok krukken ned fra hyllen over benken, hvor den hadde stått siden torsdag. Han ristet litt ut på et rent tefat med noen dråper vann og la en ny stripe pH-papir i det. Det ble rødt like fort som før.</w:t>
       </w:r>
     </w:p>
     <w:p>
@@ -6039,7 +6039,7 @@
     </w:p>
     <w:p>
       <w:r>
-        <w:t>– Noriko kan få den av meg om morgenen, sa han. – Ingen rører den fra nå og til da.</w:t>
+        <w:t xml:space="preserve">– Noriko kan få den av meg i morgen tidlig, sa han. – Ingen rører den fra nå og til da.</w:t>
       </w:r>
     </w:p>
     <w:p>
@@ -6579,7 +6579,7 @@
     </w:p>
     <w:p>
       <w:r>
-        <w:t xml:space="preserve">– Fru Wendt, sa Tanaka, du er ikke pågrepet. Du kom inn av egen fri vilje og kan gå når som helst. Jeg vil be deg om å lytte først. Jeg kommer til å legge frem det vi sitter på. Når jeg er ferdig, får du si din mening. Sånn er det for alle.</w:t>
+        <w:t xml:space="preserve">– Fru Wendt, sa Tanaka, – du er ikke pågrepet. Du kom inn av egen fri vilje og kan gå når som helst. Jeg vil be deg om å lytte først. Jeg kommer til å legge frem det vi sitter på. Når jeg er ferdig, får du si din mening. Sånn er det for alle.</w:t>
       </w:r>
     </w:p>
     <w:p>
@@ -6604,7 +6604,7 @@
     </w:p>
     <w:p>
       <w:r>
-        <w:t>– Bakeriet ditt ringte to av Gretas kunder fredag kveld, sa Tanaka, og tilbød seg å levere deres Holly Jolly-bestillinger, ord for ord fra Gretas bok. Du satt ved siden av den boken den morgenen med vinduet, med telefonen i hånden.</w:t>
+        <w:t xml:space="preserve">– Bakeriet ditt ringte to av Gretas kunder fredag kveld, sa Tanaka, – og tilbød seg å levere deres Holly Jolly-bestillinger, ord for ord fra Gretas bok. Du satt ved siden av den boken den morgenen med vinduet, med telefonen i hånden.</w:t>
       </w:r>
     </w:p>
     <w:p>
@@ -6819,7 +6819,7 @@
     </w:p>
     <w:p>
       <w:r>
-        <w:t>– Foreløpig. Før du går, sa Tanaka, vil jeg be om nøkkelen til Gretas lås.</w:t>
+        <w:t xml:space="preserve">– Foreløpig. Før du går, sa Tanaka, – vil jeg be om nøkkelen til Gretas lås.</w:t>
       </w:r>
     </w:p>
     <w:p>
@@ -7209,7 +7209,7 @@
     <w:p/>
     <w:p>
       <w:r>
-        <w:t xml:space="preserve">Folk her tar med suppe til et hus som har hatt sykdom i seg. Det var ingen syke igjen å brødfø, så i stedet kjøpte de hyllene hennes tomme. Innen klokken to sto køen ut av døren til Holly Jolly og halvveis nedover kvartalet, mens de stampet i kulden. Greta hadde tent opp i hver eneste ovn, og dampen lå så tykk på glasset at man ikke kunne lese HOLLY JOLLY gjennom det fra gaten. Sjokoladebollene var borte ved halv tre-tiden. Ingefærkjeksene var borte helt ned til bunnen av krukken. Hun satte i gang en omgang kanelboller klokken tre som hun ikke hadde noen grunn til å starte så sent, og solgte hver eneste en rykende varm og uten melisglasur, før de rakk å bli kalde.</w:t>
+        <w:t xml:space="preserve">Folk her tar med suppe til et hus som har hatt sykdom i seg. Det var ingen syke igjen å brødfø, så i stedet kjøpte de hyllene hennes tomme. Innen klokken to sto køen ut av døren til Holly Jolly og halvveis nedover kvartalet, mens de stampet i kulden. Greta hadde tent opp i hver eneste ovn, og dampen lå så tykk på glasset at man ikke kunne lese HOLLY JOLLY gjennom det fra gaten. Kakaobollene var borte ved halv tre-tiden. Ingefærkjeksene var borte helt ned til bunnen av krukken. Hun satte i gang en omgang kanelboller klokken tre som hun ikke hadde noen grunn til å starte så sent, og solgte hver eneste en rykende varm og uten melisglasur, før de rakk å bli kalde.</w:t>
       </w:r>
     </w:p>
     <w:p/>
@@ -7785,7 +7785,7 @@
     <w:p/>
     <w:p>
       <w:r>
-        <w:t xml:space="preserve">Ikke kakaobollene hennes. De kunne byen utenat fra før. Hun skrev ut på et fint kort pepperkakene bestemor hadde hatt med seg fra det gamle landet, den hun sa hun aldri hadde gitt til et levende menneske og ikke aktet å begynne med heller. Så brettet hun den én gang og la den oppi sedertreet. – La dem gjøre seg fortjent til den slik jeg gjorde, sa hun tørt til det leende rommet. – Ved å være familie, eller ved å finne den i en boks.</w:t>
+        <w:t xml:space="preserve">Ikke kakaobollene hennes. De kunne byen utenat fra før. Hun skrev ut på et fint kort pepperkakeoppskriften bestemoren hennes hadde hatt med seg fra det gamle landet, den hun sa hun aldri hadde gitt til et levende menneske og ikke aktet å begynne med heller. Så brettet hun den én gang og la den oppi sedertreet. – La dem gjøre seg fortjent til den slik jeg gjorde, sa hun tørt til det leende rommet. – Ved å være familie, eller ved å finne den i en boks.</w:t>
       </w:r>
     </w:p>
     <w:p/>
@@ -8127,7 +8127,7 @@
     <w:p/>
     <w:p>
       <w:r>
-        <w:t xml:space="preserve">Han hadde ikke tent den. Han satt foran den kalde risten med underarmene på knærne og lyttet til noe jeg bare så vidt kunne høre halvveis, og da jeg kom inn, snudde han seg, og hele ansiktet hans lyste opp av rein glede.</w:t>
+        <w:t xml:space="preserve">Han hadde ikke tent det. Han satt foran den kalde risten med underarmene på knærne og lyttet til noe jeg bare så vidt kunne høre halvveis, og da jeg kom inn, snudde han seg, og hele ansiktet hans lyste opp av rein glede.</w:t>
       </w:r>
     </w:p>
     <w:p/>

</xml_diff>

<commit_message>
Full proofcheck Flour Play Norwegian: MINOR (93 fixes)
Co-Authored-By: Claude Opus 5.5 <noreply@anthropic.com>
Claude-Session: https://claude.ai/code/session_012Cm8JxdqzjuttdUSdkQCUg
</commit_message>
<xml_diff>
--- a/translated/corrected/Flour Play - ASSEMBLED - FORMATTED_Norwegian.docx
+++ b/translated/corrected/Flour Play - ASSEMBLED - FORMATTED_Norwegian.docx
@@ -202,7 +202,7 @@
     <w:p/>
     <w:p>
       <w:r>
-        <w:t xml:space="preserve">Vi var der alle sammen den formiddagen. Hele sirkelen, så nær som når noen var slått ut av forkjølelse eller passet barnebarn. Olivia ved enden av det hele i butikken sin, med garnhespene stablet opp bak seg i alle farger en vinter kan ønske seg. Dot ved siden av henne, ordknapp og rask. Deretter Claire Bennett, som skrev for Gazette, med en notisbok åpen på armlenet fordi Claire aldri hadde ordentlig fri. Hun la stadig fra seg kransen for å skrive ned en linje og plukket den opp et slag etter resten av oss. Ivy ved siden av, som lo så høyt og så beredvillig at butikken virket lysere av å ha henne i seg. Hun hadde på et vis fått bar i håret uten å merke det. Martha, den pensjonerte lærerinnen, enke på ikke fullt et år, med sin lille hvite hund Snowball sovende mot ankelen. Hånden hennes glapp ned med jevne mellomrom for å berøre øret hans. For å forsikre seg om at han fremdeles var der. Og Ellie, snill og rolig, som hadde økt sykehusdugnaden sin til tre dager i uken. Hun møtte en stålramme med den samme stødige ømheten. Kransen hennes så mindre ut som noe som var laget, og mer som noe som hadde grodd.</w:t>
+        <w:t xml:space="preserve">Vi var der alle sammen den formiddagen. Hele sirkelen, så nær som når noen var slått ut av forkjølelse eller passet barnebarn. Olivia ved enden av det hele i butikken sin, med garnhespene stablet opp bak seg i alle farger en vinter kan ønske seg. Dot ved siden av henne, ordknapp og rask. Deretter Claire Bennett, som skrev for Gazette, med en notisbok åpen på armlenet fordi Claire aldri hadde ordentlig fri. Hun la stadig fra seg kransen for å skrive ned en linje og plukket den opp et slag etter resten av oss. Ivy ved siden av, som lo så høyt og så beredvillig at butikken virket lysere av å ha henne i seg. Hun hadde på et vis fått bar i håret uten å merke det. Martha, den pensjonerte lærerinnen, enke på ikke fullt et år, med sin lille hvite hund Snowball sovende mot ankelen. Hånden hennes glapp ned med jevne mellomrom for å berøre øret hans. For å forsikre seg om at han fremdeles var der. Og Ellie, snill og rolig, som hadde økt sykehusdugnaden sin til tre dager i uken. Hun møtte en ståltrådramme med den samme stødige ømheten. Kransen hennes så mindre ut som noe som var laget, og mer som noe som hadde grodd.</w:t>
       </w:r>
     </w:p>
     <w:p/>
@@ -250,7 +250,7 @@
     <w:p/>
     <w:p>
       <w:r>
-        <w:t xml:space="preserve">– Ingen som reiser seg, kunngjorde hun, og ingen hadde vist den minste hensikt til å gjøre det heller. Hun satte en bakverkeske på størrelse med en hatteeske ned på bordet mellom konglene og båndet, og satte hendene i sidene for å mønstre oss. Greta eide Holly Jolly Bakery nede i gaten, og hun var bygget som smultringene sine, rund og drysset over det hele. Denne formiddagen hadde hun mel nedover hele forkleet som hun ikke hadde giddet å børste av. – Jeg fikk et brett sjokolade-pekanncupcakes ut av ovnen for ikke en time siden, og jeg sa til meg selv, Greta, hvem er det som sitter i en kald butikk og gjør seg nyttige i dag, og svaret var hver eneste én av dere, så vær så god.</w:t>
+        <w:t xml:space="preserve">– Ingen som reiser seg, kunngjorde hun, og ingen hadde vist det minste tegn til å gjøre det heller. Hun satte en bakverkeske på størrelse med en hatteeske ned på bordet mellom konglene og båndet, og satte hendene i sidene for å mønstre oss. Greta eide Holly Jolly Bakery nede i gaten, og hun var bygget som smultringene sine, rund og drysset over det hele. Denne formiddagen hadde hun mel nedover hele forkleet som hun ikke hadde giddet å børste av. – Jeg fikk et brett sjokolade-pekanncupcakes ut av ovnen for ikke en time siden, og jeg sa til meg selv, Greta, hvem er det som sitter i en kald butikk og gjør seg nyttige i dag, og svaret var hver eneste én av dere, så vær så god.</w:t>
       </w:r>
     </w:p>
     <w:p/>
@@ -274,7 +274,7 @@
     <w:p/>
     <w:p>
       <w:r>
-        <w:t>Greta pekte en melfingret finger mot henne i triumf og begynte å dele ut cupcakene på papirservietter.</w:t>
+        <w:t>Greta pekte en melete finger mot henne i triumf og begynte å dele ut cupcakene på papirservietter.</w:t>
       </w:r>
     </w:p>
     <w:p/>
@@ -304,7 +304,7 @@
     <w:p/>
     <w:p>
       <w:r>
-        <w:t>Det var Claire som brakte på banen den butikken, ettersom det var Claires jobb å legge merke til at noe hadde forandret seg, og alle andres bare å snakke om det etterpå.</w:t>
+        <w:t>Det var Claire som brakte butikken på banen, ettersom det var Claires jobb å legge merke til at noe hadde forandret seg, og alle andres bare å snakke om det etterpå.</w:t>
       </w:r>
     </w:p>
     <w:p/>
@@ -418,7 +418,7 @@
     <w:p/>
     <w:p>
       <w:r>
-        <w:t>For jeg kjente forskjellen. Jeg hadde levd en lang stund nå side om side med julens magi. Lenge nok til å kjenne den i marg og bein, tydelig som et fottrinn i trappen min. Dette var ikke et barn med kalde fingre. Magien var løs i Frost Falls. Den hadde vært løs siden vi ankom, på jakt etter et hjem. Mannen min holdt på å bygge en til den. Langsomt og tålmodig i verkstedet sitt, et ildsted den kunne slå seg ned ved, og den trakk seg litt nærmere varmen for hver dag som gikk. Men den hadde ikke slått seg til ro ennå. Den var fremdeles ute i byen om natten, klosset og helt uten ondskap, og gjorde de små, umulige tingene magi gjør når den har mer følelse enn vett. Snudde festivallysene fra oransje til gull. Og nå, tilsynelatende, gikk den med en barnesnømann i mørket for å se på det som hadde fanget dens vandrende oppmerksomhet.</w:t>
+        <w:t>For jeg kjente forskjellen. Jeg hadde levd en lang stund nå side om side med julens magi. Lenge nok til å kjenne den i marg og bein, tydelig som et fottrinn i trappen min. Dette var ikke et barn med kalde fingre. Magien var løs i Frost Falls. Den hadde vært løs siden vi ankom, på jakt etter et hjem. Mannen min holdt på å bygge et til den. Langsomt og tålmodig i verkstedet sitt, et ildsted den kunne slå seg ned ved, og den trakk seg litt nærmere varmen for hver dag som gikk. Men den hadde ikke slått seg til ro ennå. Den var fremdeles ute i byen om natten, klosset og helt uten ondskap, og gjorde de små, umulige tingene magi gjør når den har mer følelse enn vett. Snudde festivallysene fra oransje til gull. Og nå, tilsynelatende, snudde den en barnesnømann rundt i mørket for å se mot det som hadde fanget dens vandrende oppmerksomhet.</w:t>
       </w:r>
     </w:p>
     <w:p/>
@@ -507,7 +507,7 @@
     <w:p/>
     <w:p>
       <w:r>
-        <w:t>– Alt sammen. Hun sa det flatt, med blikket festet på bøtten. – To runder med boller. En omgang smultringer før det, hele frityrgryta full. Jeg ga frityroljen skylden først, så jeg skiftet den og frityrkokte nye. De ble like sure. Og sandwichbrødet. Hun gestikulerte mot ristene langs veggen, der brødene lå med brun skorpe og pent utseende. Hvert eneste et av dem var ødelagt. – Alt jeg har bakt siden i går middag. Rett i bøtten. En hel dag i den travleste sesongen min, Jessica. Borte.</w:t>
+        <w:t>– Alt sammen. Hun sa det flatt, med blikket festet på bøtten. – To runder med boller. En omgang smultringer før det, hele frityrgryta full. Jeg ga frityroljen skylden først, så jeg skiftet den og frityrkokte nye. De ble like sure. Og sandwichbrødet. Hun gestikulerte mot ristene langs veggen, der brødene lå med brun skorpe og pent utseende. Hvert eneste ett av dem var ødelagt. – Alt jeg har bakt siden i går middag. Rett i bøtten. En hel dag i den travleste sesongen min, Jessica. Borte.</w:t>
       </w:r>
     </w:p>
     <w:p/>
@@ -692,7 +692,7 @@
     <w:p/>
     <w:p>
       <w:r>
-        <w:t>– Jeg har ikke vært så langt oppe i dag morges.</w:t>
+        <w:t>– Jeg har ikke vært så langt oppe i morges.</w:t>
       </w:r>
     </w:p>
     <w:p/>
@@ -710,7 +710,7 @@
     <w:p/>
     <w:p>
       <w:r>
-        <w:t xml:space="preserve">Det gamle Fenwick-lokalet hadde blitt forvandlet. Der det før hadde vært mørkt glass og brunt papir, var det nå et vindu pyntet med en slik omhu at jeg stanset på fortauet. Karmene var nymalt i en blek gråfarge, fargen på et duebryst. En guirlande av granbar hang over døren, glatt og profesjonell, ingenting like kransene vi lagde på </w:t>
+        <w:t xml:space="preserve">Det gamle Fenwick-lokalet hadde blitt forvandlet. Der det før hadde vært mørkt glass og brunt papir, var det nå et vindu pyntet med en slik omhu at jeg stanset på fortauet. Karmene var nymalt i en blek gråfarge, fargen på et duebryst. En guirlande av granbar hang over døren, glatt og profesjonell, ingenting likt kransene vi lagde på </w:t>
       </w:r>
       <w:r>
         <w:t xml:space="preserve"/>
@@ -764,7 +764,7 @@
     <w:p/>
     <w:p>
       <w:r>
-        <w:t>Hun var kanskje femti, og hun bar alderen godt. Det mørke håret var trukket stramt bakover uten en eneste løs stråle i vinden som hadde blåst hår inn i øynene på alle hele morgenen. Klærne hennes var enkle og dyre. Ved siden av henne ble jeg smertelig klar over melet jeg trolig hadde dratt med meg fra Greta, og jeg hadde en følelse av at hun hadde sett det først.</w:t>
+        <w:t>Hun var kanskje femti, og hun bar alderen godt. Det mørke håret var trukket stramt bakover uten et eneste løst hårstrå i vinden som hadde blåst hår inn i øynene på alle hele morgenen. Klærne hennes var enkle og dyre. Ved siden av henne ble jeg smertelig klar over melet jeg trolig hadde dratt med meg fra Greta, og jeg hadde en følelse av at hun hadde sett det først.</w:t>
       </w:r>
     </w:p>
     <w:p/>
@@ -836,7 +836,7 @@
     <w:p/>
     <w:p>
       <w:r>
-        <w:t xml:space="preserve">– Det fine arbeidet, ja. Alltid. Når det gjelder volumet, har jeg leverandører. Det er en grossist ut fra Portland som sender meg mel, smør og overtrekkssjokolade i pallvis, bedre enn noe du finner i detaljhandelen, og halvparten så billig med den mengden jeg skal ha. Hun fortsatte om overtrekkssjokoladen, langsomt, som om jeg aldri hadde smeltet sjokolade i hele mitt liv. – Det er sjokolade laget for overtrekk. Mer kakaosmør enn platene du kjøper, forstår du, så den renner tynt og stivner med et knekk.</w:t>
+        <w:t xml:space="preserve">– Det fine arbeidet, ja. Alltid. Når det gjelder volumet, har jeg leverandører. Det er en grossist ut fra Portland som sender meg mel, smør og overtrekkssjokolade pallvis, bedre enn noe du finner i detaljhandelen, og halvparten så billig med den mengden jeg skal ha. Hun fortsatte om overtrekkssjokoladen, langsomt, som om jeg aldri hadde smeltet sjokolade i hele mitt liv. – Det er sjokolade laget for overtrekk. Mer kakaosmør enn platene du kjøper, forstår du, så den renner tynt og stivner med et knekk.</w:t>
       </w:r>
     </w:p>
     <w:p/>
@@ -974,7 +974,7 @@
     <w:p/>
     <w:p>
       <w:r>
-        <w:t>– Jeg vil strikke til kolonnen med varme ting, sa jeg, – og jeg vil slepe med meg Nick til å bære tønner, og vi skal sørge for at det blir gjort. Jeg tenkte på Greta, som ville ha gitt bort hele butikken sin for dette for en uke siden og kanskje ikke har noe å gi nå. – Byen kunne trenge det i år.</w:t>
+        <w:t>– Jeg vil strikke til kolonnen med varme ting, sa jeg, – og jeg vil slepe med meg Nick til å bære tønner, og vi skal sørge for at det blir gjort. Jeg tenkte på Greta, som ville ha gitt bort hele butikken sin for dette for en uke siden og kanskje ikke hadde noe å gi nå. – Byen kunne trenge det i år.</w:t>
       </w:r>
     </w:p>
     <w:p/>
@@ -1105,7 +1105,7 @@
     <w:p/>
     <w:p>
       <w:r>
-        <w:t>Jeg ble værende til jeg fikk henne til å sitte med en kopp te og et halvt løfte om å slutte å bake for resten av dagen. Så gikk jeg sakte hjem, mens jeg vridde på hodet og ikke kom noen vei.</w:t>
+        <w:t>Jeg ble værende til jeg fikk henne til å sitte med en kopp te og et halvt løfte om å slutte å bake for resten av dagen. Så gikk jeg sakte hjem, mens jeg grublet over det og ikke kom noen vei.</w:t>
       </w:r>
     </w:p>
     <w:p/>
@@ -1351,7 +1351,7 @@
     <w:p/>
     <w:p>
       <w:r>
-        <w:t xml:space="preserve">Hun ventet ikke på svar. Hun gikk forbi montrene og inn på kjøkkenet i bakhuset, og kom ut igjen med Gretas brede kost. Hun begynte i ytterkantene av glassfonnen og jobbet seg innover med korte, harde tak, slik at hun samlet glasset i én haug og ikke lot en eneste skår gli under montrene. Da jeg kom for å hjelpe til, nikket hun mot feiebrettet ved døren.</w:t>
+        <w:t xml:space="preserve">Hun ventet ikke på svar. Hun gikk forbi montrene og inn på kjøkkenet bakerst, og kom ut igjen med Gretas brede kost. Hun begynte i ytterkantene av glassfonnen og jobbet seg innover med korte, harde tak, slik at hun samlet glasset i én haug og ikke lot en eneste skår gli under montrene. Da jeg kom for å hjelpe til, nikket hun mot feiebrettet ved døren.</w:t>
       </w:r>
     </w:p>
     <w:p/>
@@ -1548,7 +1548,7 @@
     <w:p/>
     <w:p>
       <w:r>
-        <w:t>– Så ble de uenige, fortsatte Dot. – For tjuefem år siden. Sånn cirka. Greta kjøpte henne ut. Det var mye bitterhet rundt bygget og navnet, og hvem sin pai det var.</w:t>
+        <w:t>– Så gikk de hver til sitt, fortsatte Dot. – For tjuefem år siden. Sånn cirka. Greta kjøpte henne ut. Det var mye bitterhet rundt bygget og navnet, og hvem sin pai det var.</w:t>
       </w:r>
     </w:p>
     <w:p/>
@@ -1596,7 +1596,7 @@
     <w:p/>
     <w:p>
       <w:r>
-        <w:t xml:space="preserve">– Jeg sier det ingen andre vil si, sa Dot, – siden jeg er gammel og ikke bryr meg lenger. – Pete Garcia.</w:t>
+        <w:t xml:space="preserve">– Jeg sier det ingen andre vil si, sa Dot, – siden jeg er gammel og ikke bryr meg lenger. Pete Garcia.</w:t>
       </w:r>
     </w:p>
     <w:p/>
@@ -1698,7 +1698,7 @@
     <w:p/>
     <w:p>
       <w:r>
-        <w:t xml:space="preserve">– Unger, samtykket Olivia, og det bredde seg en generell avspenning i sirkelen, en lettelse over et navn som ikke såret noen. – Malingen, i alle fall. Det høres ut som unger for meg. En uttråkket gutt med en stjålet sprayboks, noen store, stygge ord, og så stikke før noen ser det. Det var sånn ballplassgjerdet ble malt for to somre siden, hvis dere husker det. Det var Petersen-gutten og en venn. En skrekk og gru, en skrubbing og en alvorsprat med fedrene deres var slutten på det.</w:t>
+        <w:t xml:space="preserve">– Unger, samtykket Olivia, og det bredde seg en generell avspenning i sirkelen, en lettelse over et navn som ikke såret noen. – Malingen, i alle fall. Det høres ut som unger for meg. En uttråkket gutt med en stjålet sprayboks, noen store, stygge ord, og så stikke før noen ser det. Det var sånn ballplassgjerdet ble malt for to somre siden, hvis dere husker det. Det var Petersen-gutten og en venn. En skikkelig skremsel, en skrubbing og en alvorsprat med fedrene deres var slutten på det.</w:t>
       </w:r>
     </w:p>
     <w:p/>
@@ -1728,7 +1728,7 @@
     <w:p/>
     <w:p>
       <w:r>
-        <w:t xml:space="preserve">– Der har vi deg, sa Olivia kjærlig. – Vi andre har løst saken tre ganger før kjelen har kokt opp, og Jessica sitter der og binder granbar uten å ville nevne et eneste menneske.</w:t>
+        <w:t xml:space="preserve">– Det er så typisk deg, sa Olivia kjærlig. – Vi andre har løst saken tre ganger før kjelen har kokt opp, og Jessica sitter der og binder granbar uten å ville nevne et eneste menneske.</w:t>
       </w:r>
     </w:p>
     <w:p/>
@@ -1776,7 +1776,7 @@
     <w:p/>
     <w:p>
       <w:r>
-        <w:t>– Pass deg for isen ved kirkeenden, sa Martha til barnet. – Få ham hjem før det blir mørkt. Ikke et skritt lenger enn allmenningen.</w:t>
+        <w:t>– Pass deg for isen ved kirkeenden, sa Martha til barnet. – Få ham hjem før det blir helt mørkt. Ikke et skritt lenger enn allmenningen.</w:t>
       </w:r>
     </w:p>
     <w:p/>
@@ -2023,7 +2023,7 @@
     </w:p>
     <w:p>
       <w:r>
-        <w:t xml:space="preserve">Jeg lot ham beholde ydmykheten, fordi det var sant. Men jeg så hvordan han ikke ville ta imot en eneste smule ære som ikke åpenbart var hans. I oktober hadde Theo Hussein strukket seg forbi det som var hans, og tatt det som ikke var det, av en årsak som var nesten god, og med midler som var tvers igjennom gale. Det hadde kostet ham plassen i spissen for Historielaget han elsket, og nesten kostet ham hele byens aktelse. Nå ville han ikke engang ta imot den lille, ærlige anerkjennelsen for et heldig funn. Han visste nøyaktig hvor langt et enkelt feilsteg kunne føre, og han gikk varsomt av den grunn. Jeg lot det passere uten ros. Han hadde bedt om, uten å spørre, om å slippe det.</w:t>
+        <w:t xml:space="preserve">Jeg lot ham beholde ydmykheten, fordi det var sant. Men jeg så hvordan han ikke ville ta imot en eneste smule ære som ikke åpenbart var hans. I oktober hadde Theo Hussein strukket seg forbi det som var hans, og tatt det som ikke var det, av en årsak som var nesten god, og med midler som var tvers igjennom gale. Det hadde kostet ham plassen i spissen for Historielaget han elsket, og nesten kostet ham hele byens aktelse. Nå ville han ikke engang ta imot den lille, ærlige anerkjennelsen for et heldig funn. Han visste nøyaktig hvor langt et enkelt feilsteg kunne føre, og han gikk varsomt av den grunn. Jeg lot det passere uten ros. Han hadde, uten å spørre, bedt om å slippe den.</w:t>
       </w:r>
     </w:p>
     <w:p/>
@@ -2409,7 +2409,7 @@
     </w:p>
     <w:p>
       <w:r>
-        <w:t xml:space="preserve">Ikke langt. Det var akkurat det som gjorde det komisk i stedet for skremmende. Som gjorde at folk på gaten lo i stedet for å låse dørene sine. Tretti centimeter, kanskje seksti. Barnas tre tjukke karer på allmenningen hadde stått på en vennskapelig rekke vendt mot veien. I natten hadde de trukket sammen, skulder mot klumpete skulder. Som om de hadde samlet seg for å diskutere noe og ville være frabedt å bli avbrutt. Den prektige snømannen ved krigsminnesmerket, nesten like høy som en mann, hadde forlatt sin post med et godt skritts margin. Han stod tippet fremover på sokkelen sin. Lente seg fram, slik et menneske lener seg mot et bål. De to ved kirken hadde kommet ned fra trappetrinnet sitt. De stod tålmodige som kirkegjengere som ventet på at dørene skulle åpne seg.</w:t>
+        <w:t xml:space="preserve">Ikke langt. Det var akkurat det som gjorde det komisk i stedet for skremmende. Som gjorde at folk på gaten lo i stedet for å låse dørene sine. Tretti centimeter, kanskje seksti. Barnas tre tjukke karer på allmenningen hadde stått på en vennskapelig rekke vendt mot veien. I løpet av natten hadde de trukket seg sammen, skulder mot klumpete skulder. Som om de hadde samlet seg for å diskutere noe og ville være frabedt å bli avbrutt. Den prektige snømannen ved krigsminnesmerket, nesten like høy som en mann, hadde forlatt sin post med et godt skritts margin. Han stod tippet fremover på sokkelen sin. Lente seg fram, slik et menneske lener seg mot et bål. De to ved kirken hadde kommet ned fra trappetrinnet sitt. De stod tålmodige som kirkegjengere som ventet på at dørene skulle åpne seg.</w:t>
       </w:r>
     </w:p>
     <w:p>
@@ -2643,7 +2643,7 @@
     <w:p/>
     <w:p>
       <w:r>
-        <w:t>Han var grundig, og han var kald, og jeg ble værende fordi Greta fanget blikket mitt tvers over den tømmende butikken med et blikk som ba meg om det.</w:t>
+        <w:t>Han var grundig, og han var kald, og jeg ble værende fordi Greta fanget blikket mitt tvers over den stadig tommere butikken med et blikk som ba meg om det.</w:t>
       </w:r>
     </w:p>
     <w:p/>
@@ -2724,7 +2724,7 @@
         <w:t>Det lukter. Jeg så en mus. Rundstykket mitt var rått i midten.</w:t>
       </w:r>
       <w:r>
-        <w:t xml:space="preserve"> Følelser stort sett, halvparten av det ren ondskap, og jeg luker ut ondskapen på dørstokken før jeg åpner mappen min. Han rettet på hatten. – Denne var ikke sånn. Den kom maskinskrevet, og den henviste til underparagrafene. Den oppga de nøyaktige reglene for temperatur på håndvask, kapittel og avsnitt. Den nevnte fugen og dørglipen med faguttrykk før jeg i det hele tatt hadde satt foten innenfor, som om den leste en sjekkliste rett fra håndboken min. Den omtalte kjølerommet som «det kalde rommet», som om det var et navn, og håndvasken som «Hobart-vasken». Den som skrev det, visste hva et storkjøkken kan bli skrevet opp for, visste det på rams, og visste nøyaktig hvor en hundre år gammel bygning hadde sine slitte punkter. Han åpnet døren mot kulden. – Noen som kan reglene så godt, er vanligvis ikke den som leverer klagen. De har som regel nok med sitt eget kjøkken.</w:t>
+        <w:t xml:space="preserve"> Følelser stort sett, halvparten av det ren ondskap, og jeg luker ut ondskapen på dørstokken før jeg åpner mappen min. Han rettet på hatten. – Denne var ikke sånn. Den kom maskinskrevet, og den henviste til underparagrafene. Den oppga de nøyaktige reglene for temperatur på håndvask, kapittel og avsnitt. Den nevnte fugen og dørglipen med faguttrykk før jeg i det hele tatt hadde satt foten innenfor, som om den leste en sjekkliste rett fra håndboken min. Den omtalte kjølerommet som «det kalde rommet», som om det var et navn, og håndvasken som «Hobart-vasken». Den som skrev det, visste hva et storkjøkken kan bli skrevet opp for, visste det på rams, og visste nøyaktig hvor en gammel bygning har sine slitte punkter. Han åpnet døren mot kulden. – Noen som kan reglene så godt, er vanligvis ikke den som leverer klagen. De har som regel nok med sitt eget kjøkken.</w:t>
       </w:r>
     </w:p>
     <w:p/>
@@ -2823,7 +2823,7 @@
     <w:p/>
     <w:p>
       <w:r>
-        <w:t xml:space="preserve">Men jeg sto i kulden og så det andre skje også, lite og stille under støtten. En mann jeg kjente flyktig, stoppet ved vinduet med sønnen sin, leste det, og ledet ham videre. Ikke uvennlig. Bare forsiktig. En kvinne sa lavt til en annen, uten å vite at jeg sto like ved: – Vel, de stenger deg ikke for ingenting, gjør de vel? og den andre svarte: – Nei, det gjør de vel ikke. Ingen av dem mente Greta det minste vondt, og begge to flyttet henne et hakk lenger bort fra det trygge i tankene sine, uten at de visste at de gjorde det. Det var våpenet. Stengingen kom til å oppheves og det gule papiret kom til å bli revet ned, men tvilen ville ikke forsvinne. Fylkesstempelet lot et anstendig, tvilende menneske si </w:t>
+        <w:t xml:space="preserve">Men jeg sto i kulden og så det andre skje også, lite og stille under støtten. En mann jeg kjente flyktig, stoppet ved vinduet med sønnen sin, leste det, og ledet ham videre. Ikke uvennlig. Bare forsiktig. En kvinne sa lavt til en annen, uten å vite at jeg sto like ved: «Vel, de stenger deg ikke for ingenting, gjør de vel?» og den andre svarte: «Nei, det gjør de vel ikke.» Ingen av dem mente Greta det minste vondt, og begge to flyttet henne et hakk lenger bort fra det trygge i tankene sine, uten at de visste at de gjorde det. Det var våpenet. Stengingen kom til å oppheves og det gule papiret kom til å bli revet ned, men tvilen ville ikke forsvinne. Fylkesstempelet lot et anstendig, tvilende menneske si </w:t>
       </w:r>
       <w:r>
         <w:rPr>
@@ -2885,13 +2885,13 @@
     <w:p/>
     <w:p>
       <w:r>
-        <w:t xml:space="preserve">– Og matutdelingen når dem.</w:t>
-      </w:r>
-    </w:p>
-    <w:p/>
-    <w:p>
-      <w:r>
-        <w:t xml:space="preserve">– Stille. Han sa det med en liten advarsel i, advarselen til en forsiktig mann som vokter en forsiktig vennlighet. – Hele vitsen med tønnen er at ingen trenger å stå fram i lyset og be om det. Men en eske går ut til den enden av byen en gang i uken, og hvis trapp den havner på, har ingen noe med. Han så på meg, og det sjenerte slapp taket i ham. – Du kan komme inn i hus som forblir stengt for resten av oss. Hvis du ville se med egne øyne hvilken familie gaten har bestemt seg for å frykte denne uken, er det en eske som må bæres, og jeg kan ikke ta den. De kjenner meg.</w:t>
+        <w:t xml:space="preserve">– Og mataksjonen når dem.</w:t>
+      </w:r>
+    </w:p>
+    <w:p/>
+    <w:p>
+      <w:r>
+        <w:t xml:space="preserve">– I det stille. Han sa det med en liten advarsel i, advarselen til en forsiktig mann som vokter en forsiktig vennlighet. – Hele vitsen med tønnen er at ingen trenger å stå fram i lyset og be om det. Men en eske går ut til den enden av byen en gang i uken, og hvis trapp den havner på, har ingen noe med. Han så på meg, og det sjenerte slapp taket i ham. – Du kan komme inn i hus som forblir stengt for resten av oss. Hvis du ville se med egne øyne hvilken familie gaten har bestemt seg for å frykte denne uken, er det en eske som må bæres, og jeg kan ikke ta den. De kjenner meg.</w:t>
       </w:r>
     </w:p>
     <w:p/>
@@ -2909,7 +2909,7 @@
     <w:p/>
     <w:p>
       <w:r>
-        <w:t>Han ga den til meg, og jeg gikk opp bakkene med den før jeg rakk å snakke meg bort fra ærendet. Doucette-familien bodde i kirkenden, der alléen sluttet å være butikker og ble til hus. Et smalt, grått sted med en synkende veranda og en lønn som hadde mistet bladene i hagen. Jeg visste at det var deres før jeg leste navnet på esken, på grunn av vedstabelen. Den var for liten. En familie som har til hensikt å holde ut en New England-vinter, stabler veden opp til takskjegget i november. Doucette-stabelen var en lav og stusslig sak under en presenning. To uker med brenning der det burde ha vært fire måneder. Og plukket gjennom en gang allerede denne måneden for det som kunne brennes.</w:t>
+        <w:t>Han ga den til meg, og jeg gikk opp bakken med den før jeg rakk å snakke meg bort fra ærendet. Doucette-familien bodde i kirkenden, der alléen sluttet å være butikker og ble til hus. Et smalt, grått sted med en synkende veranda og en lønn som hadde mistet bladene i hagen. Jeg visste at det var deres før jeg leste navnet på esken, på grunn av vedstabelen. Den var for liten. En familie som har til hensikt å holde ut en New England-vinter, stabler veden opp til takskjegget i november. Doucette-stabelen var en lav og stusslig sak under en presenning. To uker med brenning der det burde ha vært fire måneder. Og plukket gjennom en gang allerede denne måneden for det som kunne brennes.</w:t>
       </w:r>
     </w:p>
     <w:p/>
@@ -2981,7 +2981,7 @@
     <w:p/>
     <w:p>
       <w:r>
-        <w:t xml:space="preserve">– Du vet hva de sier. Hun sa det uten sinne, slitt ut forbi sinne. – Det er en butikk med knust vindu nede i alléen og en familie som henger etter med fyringsoljen oppe i bakken, og folk har regnestykket i bakhodet, fru Claus, selv de snille. Jeg har merket det i butikken. En pause før god morgenen. Et blikk som glir til kurven min og teller. Munnen hennes vrengte seg, ikke direkte bittert. – Som om en mann som ikke kan betale for oljen sin, skulle bruke en natt og en boks maling på å skremme den ene kvinnen i denne gata som har gitt et gratis brød til flere hender enn noen andre. Som om det er der en sulten mann kaster bort kreftene sine. Hun satte koppen ned. – Marc holdt på å gå ned dit for å si det til gata. Jeg stanset ham. Du renser ikke opp i noe ved å skrike til det. Du gir dem bare ropene å snakke om i stedet.</w:t>
+        <w:t xml:space="preserve">– Du vet hva de sier. Hun sa det uten sinne, slitt ut forbi sinne. – Det er en butikk med knust vindu nede i alléen og en familie som henger etter med fyringsoljen oppe i bakken, og folk har regnestykket i bakhodet, fru Claus, selv de snille. Jeg har merket det i butikken. En pause før god morgenen. Et blikk som glir til kurven min og teller. Munnen hennes vrengte seg, ikke direkte bittert. – Som om en mann som ikke kan betale for oljen sin, skulle bruke en natt og en boks maling på å skremme den ene kvinnen i denne gata som har gitt et gratis brød til flere hender enn noen andre. Som om det er der en sulten mann kaster bort kreftene sine. Hun satte koppen ned. – Marc holdt på å gå ned dit for å si det til gata. Jeg stanset ham. Man renvasker seg ikke ved å rope om det. Man gir dem bare ropingen å snakke om i stedet.</w:t>
       </w:r>
     </w:p>
     <w:p/>
@@ -2993,7 +2993,7 @@
     <w:p/>
     <w:p>
       <w:r>
-        <w:t xml:space="preserve">Jeg la det til kontoen for meg selv på veien hjem. Innrøm hele regnestykket. Innrøm en mann som var desperat nok. Jeg skal ikke være den kvinnen som reiser seg og sier at de fattige er for gode til å gjøre noe galt, noe som bare er den samme gamle grusomheten sagt på en snillere måte. En desperat mann kan kaste en murstein. Han kan, Gud forlate ham, male et ord på en vegg i mørket og hate seg selv innen morgenen. Så mye lå innenfor rekkevidden til en desperat mann.</w:t>
+        <w:t xml:space="preserve">Jeg gikk gjennom det for meg selv på veien hjem. Innrøm hele regnestykket. Innrøm en mann som var desperat nok. Jeg skal ikke være den kvinnen som reiser seg og sier at de fattige er for gode til å gjøre noe galt, noe som bare er den samme gamle grusomheten sagt på en snillere måte. En desperat mann kan kaste en murstein. Han kan, Gud forlate ham, male et ord på en vegg i mørket og hate seg selv innen morgenen. Så mye lå innenfor rekkevidden til en desperat mann.</w:t>
       </w:r>
     </w:p>
     <w:p/>
@@ -3167,7 +3167,7 @@
     </w:p>
     <w:p>
       <w:r>
-        <w:t xml:space="preserve">– Vel, sa han. – Det har ikke blitt dårlig, om det er det du håper. Fordervelse lukter på én måte og gir andre utslag på tester, og dette gjør ingen av delene. Mugg gir deg et muggent preg og et pelslag under mikroskopet, og det er ingenting av det her. Harsk fett blir skarpt, og det er ikke noe fett av betydning i vanlig mel som kan bli det. Fuktighet ville klumpet det, og dette er knusktørt. Han banket på krukken. – Dette melet er sunt. Det er ingenting i veien med melet.</w:t>
+        <w:t xml:space="preserve">– Vel, sa han. – Det har ikke blitt dårlig, om det er det du håper. Fordervelse lukter på én måte og gir andre utslag på tester, og dette gjør ingen av delene. Mugg gir deg et muggent preg og et pelslag under mikroskopet, og det er ingenting av det her. Harskt fett blir skarpt, og det er ikke noe fett av betydning i vanlig mel som kan bli det. Fuktighet ville klumpet det, og dette er knusktørt. Han banket på krukken. – Dette melet er sunt. Det er ingenting i veien med melet.</w:t>
       </w:r>
     </w:p>
     <w:p>
@@ -3212,7 +3212,7 @@
     </w:p>
     <w:p>
       <w:r>
-        <w:t xml:space="preserve">For det passet. Ikke et fuktig lager. Ikke uflaks. Et kjøpt pulver med et handelsnavn, kuttet inn i melet av en hånd som kjente mengden på grammet, gjemt i sekken og som bare viste seg på tungen, etter baksten. Jeg sto der på doktorens trapp og stilte opp de gamle faktaene på rad, slik jeg hadde gjort hos </w:t>
+        <w:t xml:space="preserve">For det passet. Ikke et fuktig lager. Ikke uflaks. Et kjøpt pulver med et handelsnavn, blandet inn i melet av en hånd som kjente mengden på grammet, gjemt i sekken og som bare viste seg på tungen, etter baksten. Jeg sto der på doktorens trapp og stilte opp de gamle faktaene på rad, slik jeg hadde gjort hos </w:t>
       </w:r>
       <w:r>
         <w:t xml:space="preserve"/>
@@ -3249,7 +3249,7 @@
     </w:p>
     <w:p>
       <w:r>
-        <w:t xml:space="preserve">Jeg kom ned mot allmenningen i det svinnende blå lyset, med intensjon om å gå rett hjem, og snømannen ved apoteket hadde flyttet på seg igjen. Den store samlingen på allmenningen lente seg fremdeles innover mot den varme, usynlige ilden sin, tålmodige som alltid. Men den som hadde stått for seg selv ved munningen av smauet disse to dagene, hadde flyttet på seg i mørket det siste døgnet, og i stedet for å lene seg mot allmenningen sammen med resten, lente den seg hardt den andre veien, kullfjeset og hele dens klumpete vekt tippet mot baksidene av butikkene i </w:t>
+        <w:t xml:space="preserve">Jeg kom ned mot allmenningen i det svinnende blå lyset, med intensjon om å gå rett hjem, og snømannen ved apoteket hadde flyttet på seg igjen. Den store samlingen på allmenningen lente seg fremdeles innover mot den varme, usynlige ilden sin, tålmodige som alltid. Men den som hadde stått for seg selv ved munningen av smuget disse to dagene, hadde flyttet på seg i mørket det siste døgnet, og i stedet for å lene seg mot allmenningen sammen med resten, lente den seg hardt den andre veien, kullfjeset og hele dens klumpete vekt tippet mot baksidene av butikkene i </w:t>
       </w:r>
       <w:r>
         <w:t xml:space="preserve"/>
@@ -3271,7 +3271,7 @@
     </w:p>
     <w:p>
       <w:r>
-        <w:t xml:space="preserve">Jeg sto og så dit den så, på de mørke baksidene av butikkene, de oppdynkede trinnene og de lukkede dørene. Magien kunne ikke si meg et navn. Det kunne den aldri. Den hadde mer hjerte enn vett, sa </w:t>
+        <w:t xml:space="preserve">Jeg sto og så dit den så, på de mørke baksidene av butikkene, de igjenføykede trinnene og de lukkede dørene. Magien kunne ikke si meg et navn. Det kunne den aldri. Den hadde mer hjerte enn vett, sa </w:t>
       </w:r>
       <w:r>
         <w:t xml:space="preserve"/>
@@ -3283,7 +3283,7 @@
         <w:t xml:space="preserve"/>
       </w:r>
       <w:r>
-        <w:t xml:space="preserve"> min, og den kunne ikke stave. Den hadde stått i to dager og vendt seg mot det smauet, og nå lente den seg mot baksidene av butikkene, og jeg skjønte ikke hvorfor.</w:t>
+        <w:t xml:space="preserve"> min, og den kunne ikke stave. Den hadde stått i to dager og vendt seg mot det smuget, og nå lente den seg mot baksidene av butikkene, og jeg skjønte ikke hvorfor.</w:t>
       </w:r>
     </w:p>
     <w:p>
@@ -3303,7 +3303,7 @@
     </w:p>
     <w:p>
       <w:r>
-        <w:t>Jeg lot snømannen være i fred med sin lange, tålmodige vakt over smauet og gikk hjem med krukken tung i kåpen, det eneste harde jeg hadde som pekte noen vei overhodet.</w:t>
+        <w:t>Jeg lot snømannen være i fred med sin lange, tålmodige vakt over smuget og gikk hjem med krukken tung i kåpen, det eneste harde jeg hadde som pekte noen vei overhodet.</w:t>
       </w:r>
     </w:p>
     <w:p>
@@ -3344,7 +3344,7 @@
     <w:p/>
     <w:p>
       <w:r>
-        <w:t xml:space="preserve">Man behøvde ikke engang å gå inn. Man kunne stille seg ved sekkene innenfor dørstokken mens hun var bøyd over ovnen med viftene på. Tilsette pulveret sitt. Røre det ut med øsen hennes. Være borte før hun snudde seg. Et minutts arbeid. Mindre. Hun bar det manipulerte melet til dunkene selv og takket kulden for trekket.</w:t>
+        <w:t xml:space="preserve">Man behøvde ikke engang å gå inn. Man kunne stille seg ved sekkene innenfor dørstokken mens hun var bøyd over ovnen med viftene på. Tilsette pulveret sitt. Røre det ut med øsen hennes. Være borte før hun snudde seg. Et minutts arbeid. Mindre. Hun ville selv bære det manipulerte melet til dunkene og takke kulden for trekket.</w:t>
       </w:r>
     </w:p>
     <w:p/>
@@ -3392,7 +3392,7 @@
     <w:p/>
     <w:p>
       <w:r>
-        <w:t>Pip svarte ikke. Hun hadde stivnet mot ankelen min. Det gjorde hun når bråket var nærmere enn jeg hadde tillatt meg å si. Hun så forbi meg, tre dører unna, på den nye, skinnende hengelåsen på slakterens port.</w:t>
+        <w:t>Pip svarte ikke. Hun hadde stivnet mot ankelen min. Det gjorde hun når trøbbelet var nærmere enn jeg hadde tillatt meg å si. Hun så forbi meg, tre dører unna, på den nye, skinnende hengelåsen på slakterens port.</w:t>
       </w:r>
     </w:p>
     <w:p/>
@@ -3464,7 +3464,7 @@
     <w:p/>
     <w:p>
       <w:r>
-        <w:t>Men det var Petes døråpning fremfor noe. Og å skaffe seg kjennskap tok ikke mer enn en natt å lære seg, og pengene til en slakter på en leverandørs regnskap var ikke så åpenbart fraværende. Og jeg kunne ikke, der jeg stod i det kalde smuget, få trøsten om at tilgang ikke var alt til å strekke seg langt nok til å dekke ubehaget ved hvem som stod midt i døra.</w:t>
+        <w:t>Men det var Petes døråpning fremfor noe. Og kunnskapen det krevde, tok ikke mer enn en natt å lære seg, og pengene til en slakter på en leverandørs regnskap var ikke så åpenbart fraværende. Og jeg kunne ikke, der jeg stod i det kalde smuget, få trøsten om at tilgang ikke var alt til å strekke seg langt nok til å dekke ubehaget ved hvem som stod midt i døra.</w:t>
       </w:r>
     </w:p>
     <w:p/>
@@ -3488,7 +3488,7 @@
     <w:p/>
     <w:p>
       <w:r>
-        <w:t xml:space="preserve">Nede i den lave enden av kvartalet stod en varebil fra bakeriet ved fortauet utenfor Holly Jolly, med </w:t>
+        <w:t xml:space="preserve">Nede i den nedre enden av kvartalet stod en varebil fra bakeriet ved fortauet utenfor Holly Jolly, med </w:t>
       </w:r>
       <w:r>
         <w:rPr>
@@ -3592,7 +3592,7 @@
     <w:p/>
     <w:p>
       <w:r>
-        <w:t>– Jeg skal ikke oppholde deg fra arbeidet ditt, sa jeg. – Jeg kom for å si at jeg hadde ført deg opp på listen. Over Gretas problemer. Ut fra den enkle saken at du er i den bakgården før daggry, og at ingen andre har en slik rett til å være der. Jeg hadde erfart at det var best å overlevere en stygg sak i sin helhet og la mannen se på den. – Og jeg kom for å si at jeg har strøket deg igjen. Hva enn som sto bak dette, trengte et temperament for mørket og en bakers fagkunnskap til pulveret, og du har ingen av delene. Du kjefter midt på dagen, og du kutter kjøtt. Det passer ikke på deg.</w:t>
+        <w:t>– Jeg skal ikke oppholde deg fra arbeidet ditt, sa jeg. – Jeg kom for å si at jeg hadde ført deg opp på listen. For Gretas problemer. Ut fra den enkle saken at du er i den bakgården før daggry, og at ingen andre har en slik rett til å være der. Jeg hadde erfart at det var best å overlevere en stygg sak i sin helhet og la mannen se på den. – Og jeg kom for å si at jeg har strøket deg igjen. Hva enn som sto bak dette, trengte et temperament for mørket og en bakers fagkunnskap til pulveret, og du har ingen av delene. Du kjefter midt på dagen, og du kutter kjøtt. Det passer ikke på deg.</w:t>
       </w:r>
     </w:p>
     <w:p/>
@@ -3622,7 +3622,7 @@
     <w:p/>
     <w:p>
       <w:r>
-        <w:t xml:space="preserve">– Den skikkelsen jeg fortalte deg om, sa han mens han pakket inn koteletten jeg ikke hadde bedt om. – Ved bakdøren hennes i mørket. Du vil vel vite alt om den nå som du tror på meg. Han la de store hendene flatt på blokken og så ut vinduet på butikkfasadene i Evergreen på den andre siden av allmenningen, som om han kunne se rett igjennom dem og inn i bakgården. – En voksen person. Ikke en unge, uansett hva byen vil tillegge en eller annen gutt med en malingsboks. Høyere enn Greta, og med et bestemt mål for øyet. Ingen dveling. Ingen oppvarming av hendene. Den visste hvorfor den var der. Og tildekket. En lang frakk, eller en kittel, en sånn løstsittende sak man har på seg på jobben for ikke å bli tilskitnet, lys i fargen, vil jeg nesten si, selv om mørket tok fargen fra den. Tett inntil veggen hennes, der vareleveringen foregår og ingen ærlige ærender har noe å gjøre. Og da frontlyktene mine svingte rundt hjørnet, var den borte, raskt og stille, ikke på flukt, men en avgang. Uten hastverk. Ferdig og borte. Han ristet på det grå hodet. – Intet ansikt. Det var aldri noe ansikt å se. Bare en arbeidsskikkelse som passet på å ikke bli sett, og som kjente Gretas rutiner bedre enn en fremmed burde. Han knøt igjen papiret. – Den varebilen igjen, en annen morgen. Parkert ved apoteket, med motoren på tomgang. Høy i taket, høyere enn en varebil trenger å være, med en stripe rød refleksteip over bakdørene. Belyst som et juletre da frontlyktene mine traff den.</w:t>
+        <w:t xml:space="preserve">– Den skikkelsen jeg fortalte deg om, sa han mens han pakket inn koteletten jeg ikke hadde bedt om. – Ved bakdøren hennes i mørket. Du vil vel vite alt om den nå som du tror på meg. Han la de store hendene flatt på blokken og så ut vinduet på butikkfasadene i Evergreen på den andre siden av allmenningen, som om han kunne se rett igjennom dem og inn i bakgården. – En voksen person. Ikke en unge, uansett hva byen vil tillegge en eller annen gutt med en malingsboks. Høyere enn Greta, og med et bestemt mål for øyet. Ingen dveling. Ingen oppvarming av hendene. Den visste hvorfor den var der. Og tildekket. En lang frakk, eller en kittel, en sånn løstsittende sak man har på seg på jobben for ikke å bli tilskitnet, lys i fargen, vil jeg nesten si, selv om mørket tok fargen fra den. Tett inntil veggen hennes, der vareleveringen foregår og ingen ærlige ærender har noe å gjøre. Og da frontlyktene mine svingte rundt hjørnet, var den borte, raskt og stille, ikke på flukt, men en avgang. Uten hastverk. Ferdig og borte. Han ristet på det grå hodet. – Intet ansikt. Det var aldri noe ansikt å se. Bare en arbeidsskikkelse som passet på å ikke bli sett, og som kjente Gretas rutiner bedre enn en fremmed burde. Han knøt igjen papiret. – Den varebilen igjen, en annen morgen. Parkert ved apoteket, med motoren tikkende mens den kjølnet. Høy i taket, høyere enn en varebil trenger å være, med en stripe rød refleksteip over bakdørene. Belyst som et juletre da frontlyktene mine traff den.</w:t>
       </w:r>
     </w:p>
     <w:p/>
@@ -3640,7 +3640,7 @@
     <w:p/>
     <w:p>
       <w:r>
-        <w:t xml:space="preserve">– Jeg jagde den vekk to ganger, ja, da jeg kom tett innpå den, sa han brydd, halvveis skamfull, som en mann tatt på fersken i å gjøre en god gjerning. – Ikke fordi jeg er så glad i henne, skal du vite. Vi snakker ikke sammen, og det kommer vi ikke til å gjøre før jeg har svelget en kamel jeg ennå er forbanna for. Men en eller annen som lurer rundt døren hennes i mørket, har ugler i mosen, feide eller ikke feide, og jeg har ikke tenkt å stå i en bakgård og se på uten å løfte en finger. Han rettet på den innpakkede koteletten mot kanten som ikke trengte det. – Det har jeg aldri fortalt henne heller. Hun ville ikke ha trodd at det kom fra meg.</w:t>
+        <w:t xml:space="preserve">– Jeg jagde den vekk to ganger, ja, da jeg kom tett innpå den, sa han brydd, halvveis skamfull, som en mann tatt på fersken i å gjøre en god gjerning. – Ikke fordi jeg er så glad i henne, skal du vite. Vi snakker ikke sammen, og det kommer vi ikke til å gjøre før jeg har svelget en kamel jeg ennå er forbanna over. Men en eller annen som lurer rundt døren hennes i mørket, har ugler i mosen, feide eller ikke feide, og jeg har ikke tenkt å stå i en bakgård og se på uten å løfte en finger. Han rettet på den innpakkede koteletten mot kanten som ikke trengte det. – Det har jeg aldri fortalt henne heller. Hun ville ikke ha trodd at det kom fra meg.</w:t>
       </w:r>
     </w:p>
     <w:p/>
@@ -3763,12 +3763,12 @@
     </w:p>
     <w:p>
       <w:r>
-        <w:t>Et øyeblikk senere satte han seg i den andre, krumbøyd, med pusten stående som en grå sky. Pip betraktet ham med hodet på skakke. Så stakk hun nebbet ned i snøen ved benkefoten, kom opp med en skinnende stålskive noen hadde mistet, og la den på tåen av støvelen hans. Han så ned på den en lang stund og sparket den ikke vekk.</w:t>
-      </w:r>
-    </w:p>
-    <w:p>
-      <w:r>
-        <w:t>– Fortell meg om kvelden den ble malt, sa jeg. – Ikke om du gjorde det. Hvor du var. Ærlig talt, og jeg merker om det er sant.</w:t>
+        <w:t>Et øyeblikk senere satte han seg i den andre enden, krumbøyd, med pusten stående som en grå sky. Pip betraktet ham med hodet på skakke. Så stakk hun nebbet ned i snøen ved benkefoten, kom opp med en skinnende stålskive noen hadde mistet, og la den på tåen av støvelen hans. Han så ned på den en lang stund og sparket den ikke vekk.</w:t>
+      </w:r>
+    </w:p>
+    <w:p>
+      <w:r>
+        <w:t>– Fortell meg om kvelden den ble malt, sa jeg. – Ikke om du gjorde det. Hvor du var. Rett frem, så merker jeg om det er rett frem.</w:t>
       </w:r>
     </w:p>
     <w:p>
@@ -3783,7 +3783,7 @@
     </w:p>
     <w:p>
       <w:r>
-        <w:t>– Spør henne. Han så på hendene sine. – Spør familien Petersen to hus oppe. De hadde søstrene mine den timen jeg løp til apoteket før det stengte. Jeg kan ikke være på to steder samtidig. Jeg prøver å si det til folk, og så har de allerede bestemt seg. Bitterheten brøt frem, ung og rå. – Fordi Greta sa meg opp. Som om jeg ville malt det på butikken hennes, av alle steder. Hun var snill mot meg. Hun er den eneste her nede som alltid betalte meg på øret og aldri kortet ned.</w:t>
+        <w:t>– Spør henne. Han så på hendene sine. – Spør familien Petersen to hus lenger opp. De hadde søstrene mine den timen jeg løp til apoteket før det stengte. Jeg kan ikke være på to steder samtidig. Jeg prøver å si det til folk, og så har de allerede bestemt seg. Bitterheten brøt frem, ung og rå. – Fordi Greta sa meg opp. Som om jeg ville malt det på butikken hennes, av alle steder. Hun var snill mot meg. Hun er den eneste her nede som alltid betalte meg på øret og aldri kortet ned.</w:t>
       </w:r>
     </w:p>
     <w:p>
@@ -3848,7 +3848,7 @@
     </w:p>
     <w:p>
       <w:r>
-        <w:t xml:space="preserve">Sirkelen møttes den kvelden uten noen kranser i rommet. Olivia hadde ringt rundt på ettermiddagen: kun strikking, for Hals tønne med varme klær var blitt tømt to ganger på en uke, og familiene opp i bakken trengte luer. Dermed ble rammene stående stablet i det indre rommet, og vi sju trakk stolene våre inn rundt ovnen med pinner og hver eneste kamgarnrest i hele butikken.</w:t>
+        <w:t xml:space="preserve">Sirkelen møttes den kvelden uten noen kranser i rommet. Olivia hadde ringt rundt på ettermiddagen: kun strikking, for Hals tønne med varme klær var blitt tømt to ganger på en uke, og familiene opp i bakken trengte luer. Dermed ble rammene stående stablet i bakrommet, og vi sju trakk stolene våre inn rundt ovnen med pinner og hver eneste kamgarnrest i hele butikken.</w:t>
       </w:r>
     </w:p>
     <w:p>
@@ -3928,7 +3928,7 @@
     </w:p>
     <w:p>
       <w:r>
-        <w:t xml:space="preserve">– Jeg var innom Sugarplum i lunsjen, sa Ivy, med minen til en kvinne som sto frem med en synd. – Ikke se sånn på meg. Hun låste opp dørene i dag morges, og halve alléen var der inne før klokka tolv. Hun kaller det for åpningsuke, noe som så vidt jeg kan skjønne betyr ingen sløyfe og full pris. Fire-femti for en liten mandelkake på størrelse med tommelen min.</w:t>
+        <w:t xml:space="preserve">– Jeg var innom Sugarplum i lunsjen, sa Ivy, med minen til en kvinne som sto frem med en synd. – Ikke se sånn på meg. Hun låste opp dørene i morges, og halve alléen var der inne før klokka tolv. Hun kaller det for åpningsuke, noe som så vidt jeg kan skjønne betyr ingen sløyfe og full pris. Fire-femti for en liten mandelkake på størrelse med tommelen min.</w:t>
       </w:r>
     </w:p>
     <w:p>
@@ -4093,7 +4093,7 @@
     </w:p>
     <w:p>
       <w:r>
-        <w:t xml:space="preserve">Den gamle esken ble værende der den var, forseglet under kortet sitt i Historielagets fremre rom til timen dens var inne. Alle hadde trukket en ren strek i tankene sine mellom de to, uten at en eneste sjel trengte å si det høyt. Den gamle skulle åpnes ved det nye året, i selskap, slik forfedrene mente. Den nye skulle fylles nå, av levende hender, og begraves uåpnet i hundre år til. Den ene ventet man på. Den andre la man til i. Da jeg så naboene mine legge sine små skatter i den nye tidskapselen mens tønner med hermetikk og brød kjørte forbi til husene i åsen, tenkte jeg at jeg aldri hadde sett Frost Falls mer fullstendig seg selv.</w:t>
+        <w:t xml:space="preserve">Den gamle esken ble værende der den var, forseglet under kortet sitt i Historielagets fremre rom til timen dens var inne. Alle hadde trukket en ren strek i tankene sine mellom de to, uten at en eneste sjel trengte å si det høyt. Den gamle skulle åpnes ved det nye året, i selskap, slik forfedrene mente. Den nye skulle fylles nå, av levende hender, og begraves uåpnet i hundre år til. Den ene ventet man på. Den andre la man til i. Da jeg så naboene mine legge sine små skatter i den nye tidskapselen mens tønner med hermetikk og brød ble båret forbi til husene i åsen, tenkte jeg at jeg aldri hadde sett Frost Falls mer fullstendig seg selv.</w:t>
       </w:r>
     </w:p>
     <w:p>
@@ -4228,7 +4228,7 @@
     </w:p>
     <w:p>
       <w:r>
-        <w:t xml:space="preserve">– Volum er egentlig bare et spørsmål om en deig som oppfører seg, sa hun lett til den lille folkemengden. – Ett brett med croissanter kan man dulle med. Men i julemengder vil man ha et mel som oppfører seg likt hver eneste dag, i varmt eller kaldt kjøkken, ellers går hele linjen din til grunne innen den tjuende. Så man behandler det. Et dryss av enzym, litt askorbinsyre, som bare er vitamin C. Ingenting du smaker, bare nok til å gjøre deigen medgjørlig og holde briochen myk en dag lenger. Leverandøren min fra Portland blander mitt etter min spesifikasjon. Hun smilte rundt på dem. – De gamle landsbakerne vil ikke røre det, selvfølgelig. De vil heller skylde på luftfuktigheten.</w:t>
+        <w:t xml:space="preserve">– Volum er egentlig bare et spørsmål om en deig som oppfører seg, sa hun lett til den lille folkemengden. – Ett brett med croissanter kan man dulle med. Men i julemengder vil man ha et mel som oppfører seg likt hver eneste dag, i varmt eller kaldt kjøkken, ellers går hele linjen din til grunne innen den tjuende. Så man behandler det. Et dryss av enzym, litt askorbinsyre, som bare er vitamin C. Ingenting du smaker, bare nok til å gjøre deigen medgjørlig og holde briochen myk en dag lenger. Leverandøren min fra Portland blander mitt etter min spesifikasjon. Hun smilte rundt på dem. – De gamle bygdebakerne vil ikke røre det, selvfølgelig. De vil heller skylde på luftfuktigheten.</w:t>
       </w:r>
     </w:p>
     <w:p>
@@ -4252,7 +4252,7 @@
     </w:p>
     <w:p>
       <w:r>
-        <w:t xml:space="preserve">Doktoren hadde sagt at et konditorikjøkken ikke ville ha bruk for det stoffet i Gretas dunk. Men hun drev handel, med en konto hos en grossist i Portland som ville sende henne hva enn hun skrev på bestillingsseddelen. Mursteinen på Gretas fliser hadde hatt gammel, grå mørtel på seg, og den eneste haugen med gammel murstein i kvartalet sto i søppelcontaineren bak butikken hennes. Og der var uken, i hånden min. Doktoren hadde ikke stått her og hørt henne.</w:t>
+        <w:t xml:space="preserve">Doktoren hadde sagt at et konditorikjøkken ikke ville ha bruk for det stoffet i Gretas dunk. Men hun var i bransjen, med en konto hos en grossist i Portland som ville sende henne hva enn hun skrev på bestillingsseddelen. Mursteinen på Gretas fliser hadde hatt gammel, grå mørtel på seg, og den eneste haugen med gammel murstein i kvartalet sto i søppelcontaineren bak butikken hennes. Og der var uken, i hånden min. Doktoren hadde ikke stått her og hørt henne.</w:t>
       </w:r>
     </w:p>
     <w:p>
@@ -4291,7 +4291,7 @@
     </w:p>
     <w:p>
       <w:r>
-        <w:t>Jeg hadde vært treig. Ikke treig til å arbeide med melet, eller bakgaten. Jeg hadde lest alt det sant. Treig på den ene tingen. Hele uken hadde jeg plukket henne opp i tankene mine og satt henne ned igjen, mens jeg jaktet på skade hos en såret gutt, en sår slakter, en familie som talte vedskier. Fordi hun var ny, og elskverdig, og hadde matet meg.</w:t>
+        <w:t>Jeg hadde vært treig. Ikke treig til å arbeide med melet, eller smuget. Jeg hadde lest alt det riktig. Treig på den ene tingen. Hele uken hadde jeg plukket henne opp i tankene mine og satt henne ned igjen, mens jeg jaktet på skade hos en såret gutt, en sår slakter, en familie som talte vedskier. Fordi hun var ny, og elskverdig, og hadde matet meg.</w:t>
       </w:r>
     </w:p>
     <w:p>
@@ -4382,7 +4382,7 @@
     <w:p/>
     <w:p>
       <w:r>
-        <w:t xml:space="preserve">– Du kommer ikke til å ha sett en desember i denne gaten som den som kommer, sa hun, avslappet, og satte koppen foran meg. – Jeg har sjekket opp tellingen. Befolkningen, menighetssammenkomstene, skolen, hele høytidskalenderen dere holder. Det er mer søt handel i denne byen i julen enn den noensinne har hatt noe sted å bruke den på, fordi den aldri har hatt annet enn det ene gamle bakeriet å bruke den hos. Til landsbypriser. På landsbyvarer. Hun sa «det ene gamle bakeriet» vennlig, og nevnte en ting som alt hørte fortiden til. – All den handelen leter etter et sted å ta veien. Og her er jeg.</w:t>
+        <w:t xml:space="preserve">– Du kommer ikke til å ha sett en desember i denne gaten som den som kommer, sa hun, avslappet, og satte koppen foran meg. – Jeg har sjekket opp tellingen. Befolkningen, kirkemiddagene, skolen, hele høytidskalenderen dere holder. Det er mer søt handel i denne byen i julen enn den noensinne har hatt noe sted å bruke den på, fordi den aldri har hatt annet enn det ene gamle bakeriet å bruke den hos. Til landsbypriser. På landsbyvarer. Hun sa «det ene gamle bakeriet» vennlig, og nevnte en ting som alt hørte fortiden til. – All den handelen leter etter et sted å ta veien. Og her er jeg.</w:t>
       </w:r>
     </w:p>
     <w:p/>
@@ -4442,13 +4442,13 @@
     <w:p/>
     <w:p>
       <w:r>
-        <w:t>– Det er bransjen min. Hun sa det uten å blunke. – Man vet hva et storkjøkken blir skrevet opp for, akkurat som du ville ha kjent delene til bilen din. Temperaturene, forseglingene, vannet. Det er den kjedelige halvdelen av arbeidet, og den halvdelen som stenger deg ute hvis du forsømmer den. Hun smilte, elskverdig og vanntett, uten en søm i den jeg kunne få en negl under. – Jeg har vært gjennom inspeksjonene mine i tre byer. Man lærer seg forskriftene utenat. Eller så overlever man ikke. Jeg håper virkelig hun ordner opp. Det er en hard bransje å bli slått av sine egne rør.</w:t>
-      </w:r>
-    </w:p>
-    <w:p/>
-    <w:p>
-      <w:r>
-        <w:t>Og det var det som var problemet med det, der jeg satt i varmen med den beste kaffen jeg hadde smakt på et år som ble kald foran meg. Hun tilsto intet annet enn dyktighet. En hard forretningskvinne som var glad for et rivals snubletrinn og lei seg på alle de riktige stedene. En jury fra hele alléen ville ikke ha kalt det noe verre enn en hard kvinnes ærlighet, og halvparten av dem ville ha likt henne desto bedre for det.</w:t>
+        <w:t>– Det er bransjen min. Hun sa det uten å blunke. – Man vet hva et storkjøkken blir skrevet opp for, akkurat som du ville ha kjent delene til bilen din. Temperaturene, forseglingene, vannet. Det er den kjedelige halvdelen av arbeidet, og den halvdelen som får deg stengt hvis du forsømmer den. Hun smilte, elskverdig og vanntett, uten en søm i det jeg kunne få en negl under. – Jeg har vært gjennom inspeksjonene mine i tre byer. Man lærer seg forskriftene utenat. Eller så overlever man ikke. Jeg håper virkelig hun ordner opp. Det er en hard bransje å bli slått av sine egne rør.</w:t>
+      </w:r>
+    </w:p>
+    <w:p/>
+    <w:p>
+      <w:r>
+        <w:t>Og det var det som var problemet med det, der jeg satt i varmen med den beste kaffen jeg hadde smakt på et år som ble kald foran meg. Hun tilsto intet annet enn dyktighet. En hard forretningskvinne som var glad for en rivals snubletrinn og lei seg på alle de riktige stedene. En jury fra hele alléen ville ikke ha kalt det noe verre enn en hard kvinnes ærlighet, og halvparten av dem ville ha likt henne desto bedre for det.</w:t>
       </w:r>
     </w:p>
     <w:p/>
@@ -4466,7 +4466,7 @@
     <w:p/>
     <w:p>
       <w:r>
-        <w:t xml:space="preserve">– Granbar og en gullsløyfe, om du ville være så snill. Hun fulgte meg til døren, elskverdig til siste slutt. – For å sitte blant de andre. Som om jeg alltid hadde vært her. Der var det igjen. Og et glimt under det da hun sa det. Eieraktig. En kvinne som så nedover alléen sin på en handel hun allerede hadde regnet som sin. Så var den borte, foldet tilbake under varmen, og hun var bare en vertinne som fulgte en gammel nabo ut.</w:t>
+        <w:t xml:space="preserve">– Granbar og en gullsløyfe, om du ville være så snill. Hun fulgte meg til døren, elskverdig til siste slutt. – For å sitte blant de andre. Som om jeg alltid hadde vært her. Der var det igjen. Og et glimt under det da hun sa det. Eieraktig. En kvinne som så nedover alléen sin på en handel hun allerede hadde regnet som sin. Så var det borte, foldet tilbake under varmen, og hun var bare en vertinne som fulgte en gammel nabo ut.</w:t>
       </w:r>
     </w:p>
     <w:p/>
@@ -4585,7 +4585,7 @@
     <w:p/>
     <w:p>
       <w:r>
-        <w:t>– Det var en boks. En annen morgen. Den lå utenfor bakdøren til Greta, og det var ikke en av melsekkene hennes. Det var en trykt eske, og jeg husker den fordi den hadde gull på seg. Gullskrift nedover siden. Jeg kunne ikke lese det fra vinduet vårt. Han så på meg da. – Da jeg så etter igjen, var den borte. Du sa jeg skulle ta den med til deg når det falt på plass.</w:t>
+        <w:t>– Det var en boks. En annen morgen. Den lå utenfor bakdøren til Greta, og det var ikke en av melsekkene hennes. Det var en trykt eske, og jeg husker den fordi den hadde gull på seg. Gullskrift nedover siden. Jeg kunne ikke lese det fra vinduet vårt. Han så på meg da. – Da jeg så etter igjen, var den borte. Du sa jeg skulle ta det med til deg når det falt på plass.</w:t>
       </w:r>
     </w:p>
     <w:p/>
@@ -4699,7 +4699,7 @@
     <w:p/>
     <w:p>
       <w:r>
-        <w:t>Han puttet noen strimler med testpapir i vesken sin, og glasset gled oppi ved siden av.</w:t>
+        <w:t>Han puttet noen strimler med testpapir i vesken sin, og krukken gled oppi ved siden av.</w:t>
       </w:r>
     </w:p>
     <w:p/>
@@ -4759,7 +4759,7 @@
     <w:p/>
     <w:p>
       <w:r>
-        <w:t>– Du har kommet inn på kjøkkenet mitt, sa hun, – i åpningsuken min, sammen med byens dyrlege, for å spørre om jeg saboterte melet til en landsbybaker.</w:t>
+        <w:t>– Du har kommet inn på kjøkkenet mitt, sa hun, – i åpningsuken min, sammen med byens dyrlege, for å spørre om jeg saboterte melet til en bygdebaker.</w:t>
       </w:r>
     </w:p>
     <w:p/>
@@ -5044,7 +5044,7 @@
     </w:p>
     <w:p>
       <w:r>
-        <w:t xml:space="preserve">Jeg kjente igjen klokken. Han hadde båret den hver dag jeg hadde kjent ham, en gammel gullklokke på en slitt lenke, tilhørende faren hans eller farens far, den ene fine gjenstanden på en nøktern og omhyggelig mann. Den lå nå ved siden av en sammenbrettet papirlapp, og jeg trengte ikke lese lappen for å forstå hva slags mening som lå bak. Det var en urmaker to byer unna som kjøpte slikt. En gullklokke i god stand ga en pen sum. Ikke taket. Ikke halvparten av taket. Men en begynnelse. Smeltearbeidet, trekkpapiret, folkene som kunne tette skjøten før den neste frosten satte inn. De små, påkrevde tingene som ingen bystyrekomité beveget seg raskt nok til å møte i løpet av en eneste hard uke.</w:t>
+        <w:t xml:space="preserve">Jeg kjente igjen klokken. Han hadde båret den hver dag jeg hadde kjent ham, en gammel gullklokke på en slitt lenke, tilhørende faren hans eller farens far, den ene fine gjenstanden på en nøktern og omhyggelig mann. Den lå nå ved siden av en sammenbrettet papirlapp, og jeg trengte ikke lese lappen for å forstå hva slags mening som lå bak. Det var en gullsmed to byer unna som kjøpte slikt. En gullklokke i god stand ga en pen sum. Ikke taket. Ikke halvparten av taket. Men en begynnelse. Smeltearbeidet, trekkpapiret, folkene som kunne tette skjøten før den neste frosten satte inn. De små, påkrevde tingene som ingen bystyrekomité beveget seg raskt nok til å møte i løpet av en eneste hard uke.</w:t>
       </w:r>
     </w:p>
     <w:p>
@@ -5074,7 +5074,7 @@
     </w:p>
     <w:p>
       <w:r>
-        <w:t>Jeg takket ham ikke. Han hadde bedt meg om det en gang, uten å be om det, om å slippe ros, og jeg hadde ikke tenkt å forandre på de reglene i et kaldt rom ved midnatt. Jeg frikjente ham heller ikke. Det var ikke mitt lodd å utdele slikt, og han hadde ikke bedt om det, og uretten han hadde begått i forrige måned, var fremdeles den uretten han hadde begått, der den lå lagret i folks minner der den hørte hjemme. Men jeg tok av meg kåpen og hengte den på en stol. Jeg sank ned på det våte gulvet ved siden av ham og strakte meg etter den neste gjennomvåte esken. Jeg holdt ham med selskap uten å si et eneste ord. Det var det eneste jeg hadde som var verdt å gi.</w:t>
+        <w:t>Jeg takket ham ikke. Han hadde en gang, uten å be om det, bedt om å slippe ros, og jeg hadde ikke tenkt å forandre på de reglene i et kaldt rom ved midnatt. Jeg frikjente ham heller ikke. Det var ikke mitt lodd å utdele slikt, og han hadde ikke bedt om det, og uretten han hadde begått i forrige måned, var fremdeles den uretten han hadde begått, der den lå lagret i folks minner der den hørte hjemme. Men jeg tok av meg kåpen og hengte den på en stol. Jeg sank ned på det våte gulvet ved siden av ham og strakte meg etter den neste gjennomvåte esken. Jeg holdt ham med selskap uten å si et eneste ord. Det var det eneste jeg hadde som var verdt å gi.</w:t>
       </w:r>
     </w:p>
     <w:p>
@@ -5135,7 +5135,7 @@
     </w:p>
     <w:p>
       <w:r>
-        <w:t xml:space="preserve">Jeg trakk fjøla midt på bordet, og det var blokka foran oss, hele Evergreen lagt ut i bordflasker og bøsser. Saltbøssen kom i den lave enden for Holly Jolly, og pepperen i den fjerne enden for Sugarplum, og jeg la skjeen langs baksiden av fjøla for smuget.</w:t>
+        <w:t xml:space="preserve">Jeg trakk fjøla midt på bordet, og det var blokka foran oss, hele Evergreen lagt ut i bordflasker og bøsser. Saltbøssen kom i den nedre enden for Holly Jolly, og pepperen i den fjerne enden for Sugarplum, og jeg la skjeen langs baksiden av fjøla for smuget.</w:t>
       </w:r>
     </w:p>
     <w:p>
@@ -5205,7 +5205,7 @@
     </w:p>
     <w:p>
       <w:r>
-        <w:t>Pip ga opp knappen og kom under bordet for å lene seg mot den våte strømpen min, som hun syntes var en forbedring fra mursteinene.</w:t>
+        <w:t>Pip ga opp knappen og kom under bordet for å lene seg mot den våte strømpen min, som hun syntes var en forbedring i forhold til mursteinene.</w:t>
       </w:r>
     </w:p>
     <w:p>
@@ -5315,7 +5315,7 @@
     </w:p>
     <w:p>
       <w:r>
-        <w:t xml:space="preserve">– Det var det jeg trodde. Så gikk Doktoren gjennom lagerrommet hennes på torsdag, og det var ikke noe syrningsmiddel der, og hun fortalte meg hvem som hadde fortalt henne om Gretas fuge. Jeg gikk ikke lenger enn det, ettersom jeg hadde avlagt løfte om ingen ansikter for kvelden. – Så jeg sitter igjen med papiret. Et flygeblad ligger som prøvetrykk på noens disk lenge før det er et flygeblad på en tavle. Noen så det der. Noen leste den uken av det og skrev en klage til fylket for å få det til å passe inn i det.</w:t>
+        <w:t xml:space="preserve">– Det var det jeg trodde. Så gikk doktoren gjennom lagerrommet hennes på torsdag, og det var ikke noe syrningsmiddel der, og hun fortalte meg hvem som hadde fortalt henne om Gretas fuge. Jeg gikk ikke lenger enn det, ettersom jeg hadde avlagt løfte om ingen ansikter for kvelden. – Så jeg sitter igjen med papiret. Et flygeblad ligger som prøvetrykk på noens disk lenge før det er et flygeblad på en tavle. Noen så det der. Noen leste den uken av det og skrev en klage til fylket for å få det til å passe inn i det.</w:t>
       </w:r>
     </w:p>
     <w:p>
@@ -5364,7 +5364,7 @@
     <w:p/>
     <w:p>
       <w:r>
-        <w:t xml:space="preserve">– Jeg har da aldri sagt at jeg holdt på å gå fra vettet, sa Martha. – Jeg sa det var pussig. Hun snudde telefonen mot meg slik at jeg kunne se anropsloggen lyse på skjermen. – En dame ringte meg i går kveld, ved middagstid. Hyggelig. Forretningsmessig. Hun sa hun ringte fra Wendt's Bakehouse borte i Bridgton, og at ettersom Holly Jolly var stengt, ville de gjerne hjelpe meg med Holly Jolly-bestillingen min. To sjokolade-pekannpaier og et dussin rundstykker, klare onsdagen før Thanksgiving. Hun senket telefonen. – Det er bestillingen min. På rundstykket nær.</w:t>
+        <w:t xml:space="preserve">– Jeg har da aldri sagt at jeg holdt på å gå fra vettet, sa Martha. – Jeg sa det var pussig. Hun snudde telefonen mot meg slik at jeg kunne se anropsloggen lyse på skjermen. – En dame ringte meg i går kveld, ved middagstid. Hyggelig. Forretningsmessig. Hun sa hun ringte fra Wendt's Bakehouse borte i Bridgton, og at ettersom Holly Jolly var stengt, ville de gjerne hjelpe meg med Holly Jolly-bestillingen min. To sjokolade-pekannpaier og et dusin rundstykker, klare onsdagen før Thanksgiving. Hun senket telefonen. – Det er bestillingen min. På rundstykket nær.</w:t>
       </w:r>
     </w:p>
     <w:p/>
@@ -5496,7 +5496,7 @@
     <w:p/>
     <w:p>
       <w:r>
-        <w:t>– Jeg blir nødt til å ringe dem. Hun fylte kjelen bakerst. – Hvis jeg ikke er åpen innen den tjuende, må jeg ringe hvert eneste navn i den boken og si til dem at de må gå et annet sted for å få paiene sine. Førti år, og jeg har aldri trengt å ta den telefonen. Hun satte kjelen på platen. – Jeg satte meg ned for å begynne i dag morges. Jeg har ikke tastet ett eneste nummer.</w:t>
+        <w:t>– Jeg blir nødt til å ringe dem. Hun fylte kjelen bakerst. – Hvis jeg ikke er åpen innen den tjuende, må jeg ringe hvert eneste navn i den boken og si til dem at de må gå et annet sted for å få paiene sine. Førti år, og jeg har aldri trengt å ta den telefonen. Hun satte kjelen på platen. – Jeg satte meg ned for å begynne i morges. Jeg har ikke tastet ett eneste nummer.</w:t>
       </w:r>
     </w:p>
     <w:p/>
@@ -5514,7 +5514,7 @@
     <w:p/>
     <w:p>
       <w:r>
-        <w:t xml:space="preserve">– Martha fikk en telefon i går kveld der de tilbød seg å ordne Holly Jolly-bestillingen hennes. To sjokolade-pekannpaier og et dussin rundstykker. Ivy fikk en hun også, med sine tre gresskarpaier.</w:t>
+        <w:t xml:space="preserve">– Martha fikk en telefon i går kveld der de tilbød seg å ordne Holly Jolly-bestillingen hennes. To sjokolade-pekannpaier og et dusin rundstykker. Ivy fikk en hun også, med sine tre gresskarpaier.</w:t>
       </w:r>
     </w:p>
     <w:p/>
@@ -5634,7 +5634,7 @@
     <w:p/>
     <w:p>
       <w:r>
-        <w:t xml:space="preserve">– At vi var for gamle til å holde det gående. Hun stanset og svelget før hun klarte å fortsette. – Hun kom med tunfisknudler til meg på mandag. Morens oppskrift. Med erter i, og knuste potetgull på toppen. Jeg hadde ikke smakt det siden hun dro. Jeg stod rett her etter at hun hadde gått og spiste halvparten av den rett fra formen og gret oppi som en idiot, og jeg vasket den opp i går kveld og satte den ved døren for å ta den med tilbake til henne. Hun så ikke på formen. – Jeg hadde tenkt å kjøre den bort til Bridgton selv. Jeg hadde tenkt å banke på døren hennes.</w:t>
+        <w:t xml:space="preserve">– At vi var for gamle til å holde det gående. Hun stanset og svelget før hun klarte å fortsette. – Hun kom med tunfiskgryte til meg på mandag. Morens oppskrift. Med erter i, og knuste potetgull på toppen. Jeg hadde ikke smakt det siden hun dro. Jeg stod rett her etter at hun hadde gått og spiste halvparten av den rett fra formen og gret oppi som en idiot, og jeg vasket den opp i går kveld og satte den ved døren for å ta den med tilbake til henne. Hun så ikke på formen. – Jeg hadde tenkt å kjøre den bort til Bridgton selv. Jeg hadde tenkt å banke på døren hennes.</w:t>
       </w:r>
     </w:p>
     <w:p/>
@@ -5694,7 +5694,7 @@
     <w:p/>
     <w:p>
       <w:r>
-        <w:t>– Det vet jeg ikke enda, sa jeg. – Jeg skal nok finne det ut. Jeg kommer ikke til deg før jeg gjør det.</w:t>
+        <w:t>– Det vet jeg ikke enda, sa jeg. – Jeg skal nok finne det ut. Jeg kommer ikke til deg med det før jeg vet det.</w:t>
       </w:r>
     </w:p>
     <w:p/>
@@ -5794,7 +5794,7 @@
     </w:p>
     <w:p>
       <w:r>
-        <w:t>Hun skrev og rynket pannen. – Ingenting i New Hampshire. La oss prøve naboen.</w:t>
+        <w:t>Hun skrev og rynket pannen. – Ingenting i New Hampshire. La oss prøve nabostaten.</w:t>
       </w:r>
     </w:p>
     <w:p>
@@ -5862,7 +5862,7 @@
     </w:p>
     <w:p>
       <w:r>
-        <w:t>– Jeg kan prøve. Skriveren startet opp med en malende lyd og begynte langsomt å dytte ut registersiden, og Pip reiste seg opp under bordet og tok tak i kanten på papiret med nebbet. Hun rygget bakover etter hvert som det kom ut, og Claire lo for første gang siden jeg hadde kommet.</w:t>
+        <w:t>– Jeg kan prøve. Skriveren startet opp med en malende lyd og begynte langsomt å dytte ut registersiden, og Pip kom fram fra under bordet og tok tak i kanten på papiret med nebbet. Hun rygget bakover etter hvert som det kom ut, og Claire lo for første gang siden jeg hadde kommet.</w:t>
       </w:r>
     </w:p>
     <w:p>
@@ -6135,7 +6135,7 @@
     </w:p>
     <w:p>
       <w:r>
-        <w:t xml:space="preserve">En tynn bunke med fakturaer fra Pelkey's lå allerede på blotteren hennes. Hun la den slitte notisboken sin oppå dem, plasserte pennen tvers over siden og så på meg mens jeg snakket. Hun hadde gjort det samme måneden før. Hun skrev ikke mens hun bestemte seg for om hun skulle tro på deg.</w:t>
+        <w:t xml:space="preserve">En tynn bunke med fakturaer fra Pelkey's lå allerede på skriveunderlaget hennes. Hun la den slitte notisboken sin oppå dem, plasserte pennen tvers over siden og så på meg mens jeg snakket. Hun hadde gjort det samme måneden før. Hun skrev ikke mens hun bestemte seg for om hun skulle tro på deg.</w:t>
       </w:r>
     </w:p>
     <w:p>
@@ -6150,7 +6150,7 @@
     </w:p>
     <w:p>
       <w:r>
-        <w:t>– Joyce Wendt satt ved siden av den med lesebrillene på og telefonen fremme. Fredag kveld fikk både Martha og Ivy hver sin oppringning fra et bakeri i Bridgton, der de ble tilbudt å fylle bestillingene deres hos Holly Jolly. Helt ned til paiene.</w:t>
+        <w:t>– Joyce Wendt satt ved siden av den med lesebrillene på og telefonen fremme. Fredag kveld fikk både Martha og Ivy hver sin oppringning fra et bakeri i Bridgton, der de fikk tilbud om å ordne Holly Jolly-bestillingene deres. Helt ned til paiene.</w:t>
       </w:r>
     </w:p>
     <w:p>
@@ -6420,7 +6420,7 @@
     </w:p>
     <w:p>
       <w:r>
-        <w:t>Ingen svarte på det. På ovnen begynte kjelen å frese. Pip tok et skritt tilbake fra varmen og foretok en dyp, formell neie for den bøyde fuglen i siden på den, og den bøyde fuglen neiet tilbake. Munnviken til Greta rørte seg og falt til ro.</w:t>
+        <w:t>Ingen svarte på det. På ovnen begynte kjelen å frese. Pip tok et skritt tilbake fra varmen og neide dypt og formelt for den bøyde fuglen i siden på den, og den bøyde fuglen neiet tilbake. Munnviken til Greta rørte seg og falt til ro.</w:t>
       </w:r>
     </w:p>
     <w:p>
@@ -6554,7 +6554,7 @@
     </w:p>
     <w:p>
       <w:r>
-        <w:t>– Alt jeg kan gjøre, sa hun mens hun dro opp glidelåsen på parkasen. – Jeg mener det. Jeg kom for å hjelpe henne. Jeg har prøvd å hjelpe henne i to uker, om hun bare hadde villet la noen gjøre det. Hun slapp nøklene på bordet ved siden av posen, en tung ring av messing og stål med varebilnøkkelen i.</w:t>
+        <w:t>– Alt jeg kan gjøre, sa hun mens hun dro ned glidelåsen på parkasen. – Jeg mener det. Jeg kom for å hjelpe henne. Jeg har prøvd å hjelpe henne i to uker, om hun bare hadde villet la noen gjøre det. Hun slapp nøklene på bordet ved siden av posen, en tung ring av messing og stål med varebilnøkkelen i.</w:t>
       </w:r>
     </w:p>
     <w:p>
@@ -6809,7 +6809,7 @@
     </w:p>
     <w:p>
       <w:r>
-        <w:t xml:space="preserve">– Du vil nok ha en advokat nå, fru Wendt, sa hun ikke uvennlig. – Det er din fulle rett, og jeg ville ha skaffet meg en i din situasjon. Men jeg vil gjøre en ting krystallklart her, så ingen misforstår senere. Det jeg sitter på, er en leverandørprotokoll med din signatur på, en kjemisk analyse, et foretaksregister, en mann som kjenner igjen varebilen din, og to kvinner bakeriet ditt ringte opp med bestillinger hentet fra en bok du ikke hadde noe med å lese i. Alt sammen nedtegnet. Ingenting av det krever at du tilstår noe som helst. Hun la fra seg pennen. – Uansett hva du angrer på i ettermiddag, og jeg tror nok det er en del, forandrer det ikke en bokstav på papiret. Du blir siktet i dag. Ring advokaten din, kom tilbake hit sammen med ham innen klokken seks, så tar vi resten i minnelighet.</w:t>
+        <w:t xml:space="preserve">– Du vil nok ha en advokat nå, fru Wendt, sa hun ikke uvennlig. – Det er din fulle rett, og jeg ville ha skaffet meg en i din situasjon. Men jeg vil gjøre en ting krystallklart her, så ingen misforstår senere. Det jeg sitter på, er en leverandørprotokoll med din signatur på, en kjemisk analyse, et foretaksregister, en mann som kjenner igjen varebilen din, og to kvinner bakeriet ditt ringte opp med bestillinger hentet fra en bok du ikke hadde noe med å lese i. Alt sammen nedtegnet. Ingenting av det krever at du tilstår noe som helst. Hun la fra seg pennen. – Uansett hva du angrer på i ettermiddag, og jeg tror nok det er en del, forandrer det ikke en bokstav på papiret. Du blir siktet i dag. Ring advokaten din, kom tilbake hit sammen med ham innen klokken seks, så tar vi resten i all stillhet.</w:t>
       </w:r>
     </w:p>
     <w:p>
@@ -6824,7 +6824,7 @@
     </w:p>
     <w:p>
       <w:r>
-        <w:t>Joyce så på henne et øyeblikk. Så plukket hun opp ringen, fant nøkkelen uten å se og vippet den av med tommelfingeren. Det var en liten messingnøkkel, slitt glatt på akselen. Hun la den på bordet foran Greta, ikke foran Tanaka.</w:t>
+        <w:t>Joyce så på henne et øyeblikk. Så plukket hun opp ringen, fant nøkkelen uten å se og vippet den av med tommelfingeren. Det var en liten messingnøkkel, slitt glatt på skuldrene. Hun la den på bordet foran Greta, ikke foran Tanaka.</w:t>
       </w:r>
     </w:p>
     <w:p>
@@ -6874,7 +6874,7 @@
     <w:p/>
     <w:p>
       <w:r>
-        <w:t xml:space="preserve">Det hadde blitt gjort i stillhet, slik hun hadde sagt det ville bli. Ingen sal. Ingen folkemengde. Hun hadde hentet melkrukken min fra doktorens låste skap selv, med hans signerte lapp liggende ved siden av, og tatt Dannys ord med seg litt til side, og skrevet ned hvert eneste trinn underveis.</w:t>
+        <w:t xml:space="preserve">Det hadde blitt gjort i stillhet, slik hun hadde sagt det ville bli. Ingen sal. Ingen folkemengde. Hun hadde hentet melkrukken min fra doktorens låste skap selv, med hans signerte lapp liggende ved siden av, og tatt imot Dannys forklaring varsomt og i enerom, og skrevet ned hvert eneste trinn underveis.</w:t>
       </w:r>
     </w:p>
     <w:p/>
@@ -6922,7 +6922,7 @@
     <w:p/>
     <w:p>
       <w:r>
-        <w:t xml:space="preserve">– Det er rettens sak. Kan hun risikere fengsel for dette? På papiret. Jeg ville blitt overrasket. Det statsadvokatembetet kommer til å be om, er erstatning. Hun lot pennen gli nedover en kolonne. – Hver eneste melpose hun ødela, og vindusglaset. Og det Greta tapte på å stå stengt med Thanksgiving rett rundt hjørnet. En offeradvokat fra det kontoret kommer til å ringe Greta denne uken med et skjema. Si til henne at hun må finne frem kvitteringene sine. Jeg stikker innom i ettermiddag og leser opp mitt tall, slik at hun hører det fra meg først. Statsadvokatembetet kommer til å lage sitt eget, men det blir ikke langt unna.</w:t>
+        <w:t xml:space="preserve">– Det er rettens sak. Kan hun risikere fengsel for dette? På papiret. Jeg ville blitt overrasket. Det statsadvokatembetet kommer til å be om, er erstatning. Hun lot pennen gli nedover en kolonne. – Hver eneste melpose hun ødela, og vindusglasset. Og det Greta tapte på å stå stengt med Thanksgiving rett rundt hjørnet. En offeradvokat fra det kontoret kommer til å ringe Greta denne uken med et skjema. Si til henne at hun må finne frem kvitteringene sine. Jeg stikker innom i ettermiddag og leser opp mitt tall, slik at hun hører det fra meg først. Statsadvokatembetet kommer til å lage sitt eget, men det blir ikke langt unna.</w:t>
       </w:r>
     </w:p>
     <w:p/>
@@ -6940,7 +6940,7 @@
     <w:p/>
     <w:p>
       <w:r>
-        <w:t>– Så har vi den andre siden av det, sa Tanaka. – Wendt's har statlig bevilling til å selge brød engros. Når eieren av en lisensiert matbedrift blir siktet for å ødelegge mat, mener jeg staten bør få høre det fra meg, så jeg fortalte det til dem i går kveld. Inspektøren deres stod på dørstokken hennes før daggry i dag morges.</w:t>
+        <w:t>– Så har vi den andre siden av det, sa Tanaka. – Wendt's har statlig bevilling til å selge brød engros. Når eieren av en lisensiert matbedrift blir siktet for å ødelegge mat, mener jeg staten bør få høre det fra meg, så jeg fortalte det til dem i går kveld. Inspektøren deres stod på dørstokken hennes før daggry i morges.</w:t>
       </w:r>
     </w:p>
     <w:p/>
@@ -7197,7 +7197,7 @@
     <w:p/>
     <w:p>
       <w:r>
-        <w:t xml:space="preserve">Nyheten spredte seg gjennom Frost Falls ved lunsjtid like raskt som tvilen hadde gjort, bare at denne gangen var den varm. Det var ikke melet hennes. Det hadde aldri vært melet hennes. Det var Joyce Wendt borte fra Bridgton, den gamle partneren hennes, hun som tok med brødet til grendehuset. Hun hadde gjort melet surt med vilje og løyet for fylket for å få stengt henne ute, og fru Claus hadde tatt henne på fersken med en pingvin. Den siste delen vokste litt i gjenfortellingen, og jeg lot den gjøre det. Da den nådde enden av Evergreen, hadde Pip utført bragder jeg ikke ville ha trodd på.</w:t>
+        <w:t xml:space="preserve">Nyheten spredte seg gjennom Frost Falls ved lunsjtid like raskt som tvilen hadde gjort, bare at denne gangen var den varm. Det var ikke melet hennes. Det hadde aldri vært melet hennes. Det var Joyce Wendt borte fra Bridgton, den gamle partneren hennes, hun som tok med brødet til grendehuset. Hun hadde gjort melet surt med vilje og løyet for fylket for å få henne stengt, og fru Claus hadde tatt henne på fersken med en pingvin. Den siste delen vokste litt i gjenfortellingen, og jeg lot den gjøre det. Da den nådde enden av Evergreen, hadde Pip utført bragder jeg ikke ville ha trodd på.</w:t>
       </w:r>
     </w:p>
     <w:p/>
@@ -7383,7 +7383,7 @@
     <w:p/>
     <w:p>
       <w:r>
-        <w:t xml:space="preserve">– Nei, kjære deg. Det er ingen andre enn meg som fyller den. </w:t>
+        <w:t xml:space="preserve">– Nei, kjære deg. Det er ingen andre enn meg som leverer den. </w:t>
       </w:r>
     </w:p>
     <w:p/>
@@ -7466,7 +7466,7 @@
     <w:p/>
     <w:p>
       <w:r>
-        <w:t xml:space="preserve">Han sto ved foten av inngangstrappen med et nylinjert ark på skriveplaten sin, med kolonner skrevet i sin lille, firkantede håndskrift: hvem som tok med tømmer eller bil, og hvem som bare stilte med to armer og en termos. Han krysset av hver linje etter hvert som folk ankom. Vi kom opp alléen slik vi hadde gjort for Hals tønner, bare at vi bar takbjelker i stedet for blikkbokser.</w:t>
+        <w:t xml:space="preserve">Han sto ved foten av inngangstrappen med et nytt linjert ark på skriveplaten sin, med kolonner skrevet i sin lille, firkantede håndskrift: hvem som tok med tømmer eller bil, og hvem som bare stilte med to armer og en termos. Han krysset av hver linje etter hvert som folk ankom. Vi kom opp alléen slik vi hadde gjort for Hals tønner, bare at vi bar takbjelker i stedet for blikkbokser.</w:t>
       </w:r>
     </w:p>
     <w:p/>
@@ -7502,7 +7502,7 @@
     <w:p/>
     <w:p>
       <w:r>
-        <w:t xml:space="preserve">Skjøten over arkivrommet hadde sluppet smeltevannet igjennom til de lave hyllene. Ved lunsjtid var det dekket med nytt undertak og ny takspon, forseglet mot vinteren for første gang på lenger enn noen kunne huske. Et dusin menn som aldri hadde lagt tak på annet enn sine egne hus, la det, og det ble rett likevel.</w:t>
+        <w:t xml:space="preserve">Skjøten over arkivrommet hadde sluppet smeltevannet igjennom til de lave hyllene. Ved lunsjtid var den dekket med nytt undertak og ny takspon, forseglet mot vinteren for første gang på lenger enn noen kunne huske. Et dusin menn som aldri hadde lagt tak på annet enn sine egne hus, la det, og det ble rett likevel.</w:t>
       </w:r>
     </w:p>
     <w:p/>
@@ -7526,7 +7526,7 @@
     <w:p/>
     <w:p>
       <w:r>
-        <w:t xml:space="preserve">Det sto en krukke på disken til Kelly på Starlight som hadde fylt seg opp siden matinnsamlingen startet. Mynter, for det meste. En og annen brettet seddel. Det var penger fra Greta, fra gårsdagens kasse, selv om hun hadde holdt tilbake det sesongen trengte, og ikke ville høre et ord om å gi mer. Kapselinnsamlingen ga også litt. Folk som hadde båret restene sine til sedertreboksen, ville ha en bygning som fremdeles sto, for å oppbevare den i, og de stakk hendene i lommene for den saks skyld. Sirkelen hadde arrangert et lotteri. Martha hadde solgt et teppe hun hadde ment å beholde.</w:t>
+        <w:t xml:space="preserve">Det sto en krukke på disken til Kelly på Starlight som hadde fylt seg opp siden mataksjonen startet. Mynter, for det meste. En og annen brettet seddel. Det var penger fra Greta, fra gårsdagens kasse, selv om hun hadde holdt tilbake det sesongen trengte, og ikke ville høre et ord om å gi mer. Kapselinnsamlingen ga også litt. Folk som hadde båret restene sine til sedertreboksen, ville ha en bygning som fremdeles sto, for å oppbevare den i, og de stakk hendene i lommene for å sørge for det. Sirkelen hadde arrangert et lotteri. Martha hadde solgt et teppe hun hadde ment å beholde.</w:t>
       </w:r>
     </w:p>
     <w:p/>
@@ -7544,13 +7544,13 @@
     <w:p/>
     <w:p>
       <w:r>
-        <w:t xml:space="preserve">Nær lunsjtid fisket Hal opp en konvolutt uten navn på fra sigarboksen og talte den to ganger. Den inneholdt omtrent det en gullklokke i god stand innbrakte hos en urmaker to byer unna. Theo var oppe på stigen med en armfull takspon i det øyeblikket, og jeg lot ham bli der.</w:t>
-      </w:r>
-    </w:p>
-    <w:p/>
-    <w:p>
-      <w:r>
-        <w:t>Ved ettermiddagstid hadde Hal sendt bud på en andre sigarboks fra Starlight.</w:t>
+        <w:t xml:space="preserve">Nær lunsjtid fisket Hal opp en konvolutt uten navn på fra sigarboksen og talte den to ganger. Den inneholdt omtrent det en gullklokke i god stand innbrakte hos en gullsmed to byer unna. Theo var oppe på stigen med en armfull takspon i det øyeblikket, og jeg lot ham bli der.</w:t>
+      </w:r>
+    </w:p>
+    <w:p/>
+    <w:p>
+      <w:r>
+        <w:t>Midt på ettermiddagen hadde Hal sendt bud på en andre sigarboks fra Starlight.</w:t>
       </w:r>
     </w:p>
     <w:p/>
@@ -8031,7 +8031,7 @@
     <w:p/>
     <w:p>
       <w:r>
-        <w:t>Pip tok sardinen og trakk seg tilbake under en stol for å nyte den uten rekkevidde for et eventuelt stemningsskifte. Greta gikk tilbake til stjernene sine, og ovnene tikket.</w:t>
+        <w:t>Pip tok sardinen og trakk seg tilbake under en stol for å nyte den utenfor rekkevidde for et eventuelt stemningsskifte. Greta gikk tilbake til stjernene sine, og ovnene tikket.</w:t>
       </w:r>
     </w:p>
     <w:p/>
@@ -8055,13 +8055,13 @@
     <w:p/>
     <w:p>
       <w:r>
-        <w:t xml:space="preserve">Eskene stod side om side i glassdisken i det fremre rommet, i det grå lyset. Den nye sedertreesken med lokket igjen og sitt nye kort, holdt ullen, billetten, de røde vottene og alt det andre. En mynt hadde sneket seg stille og blitt varm blant dem, en mynt som bare Nick og jeg noen gang ville gjøre regnskap for.</w:t>
-      </w:r>
-    </w:p>
-    <w:p/>
-    <w:p>
-      <w:r>
-        <w:t>Theo satt ved bordet sitt med lampen tent, og listet en ny stift løs fra en ny sprukket, gammel ting. Han så opp, nikket såvidt med hodet og gikk tilbake til det.</w:t>
+        <w:t xml:space="preserve">Eskene stod side om side i glassmonteren i det fremre rommet, i det grå lyset. Den nye sedertreesken med lokket igjen og sitt nye kort, holdt ullen, billetten, de røde vottene og alt det andre. En mynt hadde sneket seg stille og blitt varm blant dem, en mynt som bare Nick og jeg noen gang ville gjøre regnskap for.</w:t>
+      </w:r>
+    </w:p>
+    <w:p/>
+    <w:p>
+      <w:r>
+        <w:t>Theo satt ved bordet sitt med lampen tent, og listet en ny stift løs fra en ny sprukket, gammel ting. Han så opp, nikket så vidt med hodet og gikk tilbake til det.</w:t>
       </w:r>
     </w:p>
     <w:p/>
@@ -8133,13 +8133,13 @@
     <w:p/>
     <w:p>
       <w:r>
-        <w:t>– Jess, sa han. – Kom og kjenne på dette.</w:t>
-      </w:r>
-    </w:p>
-    <w:p/>
-    <w:p>
-      <w:r>
-        <w:t xml:space="preserve">Jeg satte fra meg pakkene og gikk bort til ham. Han tok hånden min og la den flatt mot de runde marksteinene. De var varme under håndflaten og gylne å se til, akkurat som de hadde vært siden kvelden han viste meg det, med lyset som veltet opp fra selve nakne steinen. Og i risten, der det aldri hadde vært lagt noe, hadde noen tråder av gull seget ned ut av luften og la seg langs jernstengene, lavt og jevnt, som de første glørne i et bål ingen hadde tent.</w:t>
+        <w:t>– Jess, sa han. – Kom og kjenn på dette.</w:t>
+      </w:r>
+    </w:p>
+    <w:p/>
+    <w:p>
+      <w:r>
+        <w:t xml:space="preserve">Jeg satte fra meg pakkene og gikk bort til ham. Han tok hånden min og la den flatt mot de runde marksteinene. De var varme under håndflaten og gylne å se til, akkurat som de hadde vært siden kvelden han viste meg det, med lyset som veltet opp fra selve den nakne steinen. Og i risten, der det aldri hadde vært lagt noe, hadde noen tråder av gull seget ned ut av luften og la seg langs jernstengene, lavt og jevnt, som de første glørne i et bål ingen hadde tent.</w:t>
       </w:r>
     </w:p>
     <w:p/>

</xml_diff>